<commit_message>
feat(report): make Word equations native editable objects (OMML)
Switch the Word report's equations from rendered images to native, editable
Word equation objects (OMML). The LaTeX is converted LaTeX -> MathML -> OMML
with the pure-Python latex2mathml + mathml2omml packages and inserted via
python-docx's XML API, so a reader can click and edit formulas in Word's
equation editor — with no pandoc/Office/system binary (keeps the venv/CI
free-software model). If the toolchain is absent or a conversion fails, the
equation degrades to the matplotlib mathtext image, so a formula is never
missing. The HTML report keeps the self-contained mathtext images.

Adds latex2mathml + mathml2omml to the `report`/`dev` extras; regenerated the
.docx (19 native equations + 27 figures). ADR 0008 updated.

Co-Authored-By: Claude Opus 4.8 <noreply@anthropic.com>
</commit_message>
<xml_diff>
--- a/report/report.docx
+++ b/report/report.docx
@@ -16,7 +16,7 @@
           <w:b w:val="0"/>
           <w:color w:val="718096"/>
         </w:rPr>
-        <w:t>Substrate: Fe(110)  |  Medium: 1 M HCl  |  DFT level: B3LYP/6-311++G(d,p) (ddCOSMO:water)  |  Generated 2026-07-01 19:50</w:t>
+        <w:t>Substrate: Fe(110)  |  Medium: 1 M HCl  |  DFT level: B3LYP/6-311++G(d,p) (ddCOSMO:water)  |  Generated 2026-07-01 20:07</w:t>
       </w:r>
     </w:p>
     <w:p>
@@ -6291,40 +6291,141 @@
       </w:r>
     </w:p>
     <w:p>
-      <w:r>
-        <w:drawing>
-          <wp:inline xmlns:a="http://schemas.openxmlformats.org/drawingml/2006/main" xmlns:pic="http://schemas.openxmlformats.org/drawingml/2006/picture">
-            <wp:extent cx="2444496" cy="390144"/>
-            <wp:docPr id="28" name="Picture 28"/>
-            <wp:cNvGraphicFramePr>
-              <a:graphicFrameLocks noChangeAspect="1"/>
-            </wp:cNvGraphicFramePr>
-            <a:graphic>
-              <a:graphicData uri="http://schemas.openxmlformats.org/drawingml/2006/picture">
-                <pic:pic>
-                  <pic:nvPicPr>
-                    <pic:cNvPr id="0" name="image.png"/>
-                    <pic:cNvPicPr/>
-                  </pic:nvPicPr>
-                  <pic:blipFill>
-                    <a:blip r:embed="rId36"/>
-                    <a:stretch>
-                      <a:fillRect/>
-                    </a:stretch>
-                  </pic:blipFill>
-                  <pic:spPr>
-                    <a:xfrm>
-                      <a:off x="0" y="0"/>
-                      <a:ext cx="2444496" cy="390144"/>
-                    </a:xfrm>
-                    <a:prstGeom prst="rect"/>
-                  </pic:spPr>
-                </pic:pic>
-              </a:graphicData>
-            </a:graphic>
-          </wp:inline>
-        </w:drawing>
-      </w:r>
+      <w:pPr>
+        <w:jc w:val="center"/>
+      </w:pPr>
+      <m:oMath>
+        <m:box>
+          <m:e>
+            <m:sSub>
+              <m:e>
+                <m:r>
+                  <m:rPr>
+                    <m:sty m:val="i"/>
+                  </m:rPr>
+                  <m:t>E</m:t>
+                </m:r>
+              </m:e>
+              <m:sub>
+                <m:box>
+                  <m:e>
+                    <m:r>
+                      <m:rPr>
+                        <m:sty m:val="i"/>
+                      </m:rPr>
+                      <m:t>g</m:t>
+                    </m:r>
+                    <m:r>
+                      <m:rPr>
+                        <m:sty m:val="i"/>
+                      </m:rPr>
+                      <m:t>a</m:t>
+                    </m:r>
+                    <m:r>
+                      <m:rPr>
+                        <m:sty m:val="i"/>
+                      </m:rPr>
+                      <m:t>p</m:t>
+                    </m:r>
+                  </m:e>
+                </m:box>
+              </m:sub>
+            </m:sSub>
+            <m:r>
+              <m:rPr>
+                <m:sty m:val="p"/>
+              </m:rPr>
+              <m:t>=</m:t>
+            </m:r>
+            <m:sSub>
+              <m:e>
+                <m:r>
+                  <m:rPr>
+                    <m:sty m:val="i"/>
+                  </m:rPr>
+                  <m:t>E</m:t>
+                </m:r>
+              </m:e>
+              <m:sub>
+                <m:box>
+                  <m:e>
+                    <m:r>
+                      <m:rPr>
+                        <m:sty m:val="i"/>
+                      </m:rPr>
+                      <m:t>L</m:t>
+                    </m:r>
+                    <m:r>
+                      <m:rPr>
+                        <m:sty m:val="i"/>
+                      </m:rPr>
+                      <m:t>U</m:t>
+                    </m:r>
+                    <m:r>
+                      <m:rPr>
+                        <m:sty m:val="i"/>
+                      </m:rPr>
+                      <m:t>M</m:t>
+                    </m:r>
+                    <m:r>
+                      <m:rPr>
+                        <m:sty m:val="i"/>
+                      </m:rPr>
+                      <m:t>O</m:t>
+                    </m:r>
+                  </m:e>
+                </m:box>
+              </m:sub>
+            </m:sSub>
+            <m:r>
+              <m:rPr>
+                <m:sty m:val="p"/>
+              </m:rPr>
+              <m:t>−</m:t>
+            </m:r>
+            <m:sSub>
+              <m:e>
+                <m:r>
+                  <m:rPr>
+                    <m:sty m:val="i"/>
+                  </m:rPr>
+                  <m:t>E</m:t>
+                </m:r>
+              </m:e>
+              <m:sub>
+                <m:box>
+                  <m:e>
+                    <m:r>
+                      <m:rPr>
+                        <m:sty m:val="i"/>
+                      </m:rPr>
+                      <m:t>H</m:t>
+                    </m:r>
+                    <m:r>
+                      <m:rPr>
+                        <m:sty m:val="i"/>
+                      </m:rPr>
+                      <m:t>O</m:t>
+                    </m:r>
+                    <m:r>
+                      <m:rPr>
+                        <m:sty m:val="i"/>
+                      </m:rPr>
+                      <m:t>M</m:t>
+                    </m:r>
+                    <m:r>
+                      <m:rPr>
+                        <m:sty m:val="i"/>
+                      </m:rPr>
+                      <m:t>O</m:t>
+                    </m:r>
+                  </m:e>
+                </m:box>
+              </m:sub>
+            </m:sSub>
+          </m:e>
+        </m:box>
+      </m:oMath>
     </w:p>
     <w:p>
       <w:r>
@@ -6342,40 +6443,82 @@
       </w:r>
     </w:p>
     <w:p>
-      <w:r>
-        <w:drawing>
-          <wp:inline xmlns:a="http://schemas.openxmlformats.org/drawingml/2006/main" xmlns:pic="http://schemas.openxmlformats.org/drawingml/2006/picture">
-            <wp:extent cx="1524000" cy="371856"/>
-            <wp:docPr id="29" name="Picture 29"/>
-            <wp:cNvGraphicFramePr>
-              <a:graphicFrameLocks noChangeAspect="1"/>
-            </wp:cNvGraphicFramePr>
-            <a:graphic>
-              <a:graphicData uri="http://schemas.openxmlformats.org/drawingml/2006/picture">
-                <pic:pic>
-                  <pic:nvPicPr>
-                    <pic:cNvPr id="0" name="image.png"/>
-                    <pic:cNvPicPr/>
-                  </pic:nvPicPr>
-                  <pic:blipFill>
-                    <a:blip r:embed="rId37"/>
-                    <a:stretch>
-                      <a:fillRect/>
-                    </a:stretch>
-                  </pic:blipFill>
-                  <pic:spPr>
-                    <a:xfrm>
-                      <a:off x="0" y="0"/>
-                      <a:ext cx="1524000" cy="371856"/>
-                    </a:xfrm>
-                    <a:prstGeom prst="rect"/>
-                  </pic:spPr>
-                </pic:pic>
-              </a:graphicData>
-            </a:graphic>
-          </wp:inline>
-        </w:drawing>
-      </w:r>
+      <w:pPr>
+        <w:jc w:val="center"/>
+      </w:pPr>
+      <m:oMath>
+        <m:box>
+          <m:e>
+            <m:r>
+              <m:rPr>
+                <m:sty m:val="i"/>
+              </m:rPr>
+              <m:t>I</m:t>
+            </m:r>
+            <m:r>
+              <m:rPr>
+                <m:sty m:val="i"/>
+              </m:rPr>
+              <m:t>P</m:t>
+            </m:r>
+            <m:r>
+              <m:rPr>
+                <m:sty m:val="p"/>
+              </m:rPr>
+              <m:t>=</m:t>
+            </m:r>
+            <m:r>
+              <m:rPr>
+                <m:sty m:val="p"/>
+              </m:rPr>
+              <m:t>−</m:t>
+            </m:r>
+            <m:r>
+              <m:t/>
+            </m:r>
+            <m:sSub>
+              <m:e>
+                <m:r>
+                  <m:rPr>
+                    <m:sty m:val="i"/>
+                  </m:rPr>
+                  <m:t>E</m:t>
+                </m:r>
+              </m:e>
+              <m:sub>
+                <m:box>
+                  <m:e>
+                    <m:r>
+                      <m:rPr>
+                        <m:sty m:val="i"/>
+                      </m:rPr>
+                      <m:t>H</m:t>
+                    </m:r>
+                    <m:r>
+                      <m:rPr>
+                        <m:sty m:val="i"/>
+                      </m:rPr>
+                      <m:t>O</m:t>
+                    </m:r>
+                    <m:r>
+                      <m:rPr>
+                        <m:sty m:val="i"/>
+                      </m:rPr>
+                      <m:t>M</m:t>
+                    </m:r>
+                    <m:r>
+                      <m:rPr>
+                        <m:sty m:val="i"/>
+                      </m:rPr>
+                      <m:t>O</m:t>
+                    </m:r>
+                  </m:e>
+                </m:box>
+              </m:sub>
+            </m:sSub>
+          </m:e>
+        </m:box>
+      </m:oMath>
     </w:p>
     <w:p>
       <w:r>
@@ -6393,40 +6536,82 @@
       </w:r>
     </w:p>
     <w:p>
-      <w:r>
-        <w:drawing>
-          <wp:inline xmlns:a="http://schemas.openxmlformats.org/drawingml/2006/main" xmlns:pic="http://schemas.openxmlformats.org/drawingml/2006/picture">
-            <wp:extent cx="1578864" cy="371856"/>
-            <wp:docPr id="30" name="Picture 30"/>
-            <wp:cNvGraphicFramePr>
-              <a:graphicFrameLocks noChangeAspect="1"/>
-            </wp:cNvGraphicFramePr>
-            <a:graphic>
-              <a:graphicData uri="http://schemas.openxmlformats.org/drawingml/2006/picture">
-                <pic:pic>
-                  <pic:nvPicPr>
-                    <pic:cNvPr id="0" name="image.png"/>
-                    <pic:cNvPicPr/>
-                  </pic:nvPicPr>
-                  <pic:blipFill>
-                    <a:blip r:embed="rId38"/>
-                    <a:stretch>
-                      <a:fillRect/>
-                    </a:stretch>
-                  </pic:blipFill>
-                  <pic:spPr>
-                    <a:xfrm>
-                      <a:off x="0" y="0"/>
-                      <a:ext cx="1578864" cy="371856"/>
-                    </a:xfrm>
-                    <a:prstGeom prst="rect"/>
-                  </pic:spPr>
-                </pic:pic>
-              </a:graphicData>
-            </a:graphic>
-          </wp:inline>
-        </w:drawing>
-      </w:r>
+      <w:pPr>
+        <w:jc w:val="center"/>
+      </w:pPr>
+      <m:oMath>
+        <m:box>
+          <m:e>
+            <m:r>
+              <m:rPr>
+                <m:sty m:val="i"/>
+              </m:rPr>
+              <m:t>E</m:t>
+            </m:r>
+            <m:r>
+              <m:rPr>
+                <m:sty m:val="i"/>
+              </m:rPr>
+              <m:t>A</m:t>
+            </m:r>
+            <m:r>
+              <m:rPr>
+                <m:sty m:val="p"/>
+              </m:rPr>
+              <m:t>=</m:t>
+            </m:r>
+            <m:r>
+              <m:rPr>
+                <m:sty m:val="p"/>
+              </m:rPr>
+              <m:t>−</m:t>
+            </m:r>
+            <m:r>
+              <m:t/>
+            </m:r>
+            <m:sSub>
+              <m:e>
+                <m:r>
+                  <m:rPr>
+                    <m:sty m:val="i"/>
+                  </m:rPr>
+                  <m:t>E</m:t>
+                </m:r>
+              </m:e>
+              <m:sub>
+                <m:box>
+                  <m:e>
+                    <m:r>
+                      <m:rPr>
+                        <m:sty m:val="i"/>
+                      </m:rPr>
+                      <m:t>L</m:t>
+                    </m:r>
+                    <m:r>
+                      <m:rPr>
+                        <m:sty m:val="i"/>
+                      </m:rPr>
+                      <m:t>U</m:t>
+                    </m:r>
+                    <m:r>
+                      <m:rPr>
+                        <m:sty m:val="i"/>
+                      </m:rPr>
+                      <m:t>M</m:t>
+                    </m:r>
+                    <m:r>
+                      <m:rPr>
+                        <m:sty m:val="i"/>
+                      </m:rPr>
+                      <m:t>O</m:t>
+                    </m:r>
+                  </m:e>
+                </m:box>
+              </m:sub>
+            </m:sSub>
+          </m:e>
+        </m:box>
+      </m:oMath>
     </w:p>
     <w:p>
       <w:r>
@@ -6444,40 +6629,77 @@
       </w:r>
     </w:p>
     <w:p>
-      <w:r>
-        <w:drawing>
-          <wp:inline xmlns:a="http://schemas.openxmlformats.org/drawingml/2006/main" xmlns:pic="http://schemas.openxmlformats.org/drawingml/2006/picture">
-            <wp:extent cx="1146048" cy="432816"/>
-            <wp:docPr id="31" name="Picture 31"/>
-            <wp:cNvGraphicFramePr>
-              <a:graphicFrameLocks noChangeAspect="1"/>
-            </wp:cNvGraphicFramePr>
-            <a:graphic>
-              <a:graphicData uri="http://schemas.openxmlformats.org/drawingml/2006/picture">
-                <pic:pic>
-                  <pic:nvPicPr>
-                    <pic:cNvPr id="0" name="image.png"/>
-                    <pic:cNvPicPr/>
-                  </pic:nvPicPr>
-                  <pic:blipFill>
-                    <a:blip r:embed="rId39"/>
-                    <a:stretch>
-                      <a:fillRect/>
-                    </a:stretch>
-                  </pic:blipFill>
-                  <pic:spPr>
-                    <a:xfrm>
-                      <a:off x="0" y="0"/>
-                      <a:ext cx="1146048" cy="432816"/>
-                    </a:xfrm>
-                    <a:prstGeom prst="rect"/>
-                  </pic:spPr>
-                </pic:pic>
-              </a:graphicData>
-            </a:graphic>
-          </wp:inline>
-        </w:drawing>
-      </w:r>
+      <w:pPr>
+        <w:jc w:val="center"/>
+      </w:pPr>
+      <m:oMath>
+        <m:box>
+          <m:e>
+            <m:r>
+              <m:rPr>
+                <m:sty m:val="i"/>
+              </m:rPr>
+              <m:t>χ</m:t>
+            </m:r>
+            <m:r>
+              <m:rPr>
+                <m:sty m:val="p"/>
+              </m:rPr>
+              <m:t>=</m:t>
+            </m:r>
+            <m:f>
+              <m:num>
+                <m:box>
+                  <m:e>
+                    <m:r>
+                      <m:rPr>
+                        <m:sty m:val="i"/>
+                      </m:rPr>
+                      <m:t>I</m:t>
+                    </m:r>
+                    <m:r>
+                      <m:rPr>
+                        <m:sty m:val="i"/>
+                      </m:rPr>
+                      <m:t>P</m:t>
+                    </m:r>
+                    <m:r>
+                      <m:rPr>
+                        <m:sty m:val="p"/>
+                      </m:rPr>
+                      <m:t>+</m:t>
+                    </m:r>
+                    <m:r>
+                      <m:rPr>
+                        <m:sty m:val="i"/>
+                      </m:rPr>
+                      <m:t>E</m:t>
+                    </m:r>
+                    <m:r>
+                      <m:rPr>
+                        <m:sty m:val="i"/>
+                      </m:rPr>
+                      <m:t>A</m:t>
+                    </m:r>
+                  </m:e>
+                </m:box>
+              </m:num>
+              <m:den>
+                <m:box>
+                  <m:e>
+                    <m:r>
+                      <m:rPr>
+                        <m:sty m:val="p"/>
+                      </m:rPr>
+                      <m:t>2</m:t>
+                    </m:r>
+                  </m:e>
+                </m:box>
+              </m:den>
+            </m:f>
+          </m:e>
+        </m:box>
+      </m:oMath>
     </w:p>
     <w:p>
       <w:r>
@@ -6495,40 +6717,137 @@
       </w:r>
     </w:p>
     <w:p>
-      <w:r>
-        <w:drawing>
-          <wp:inline xmlns:a="http://schemas.openxmlformats.org/drawingml/2006/main" xmlns:pic="http://schemas.openxmlformats.org/drawingml/2006/picture">
-            <wp:extent cx="1780032" cy="475488"/>
-            <wp:docPr id="32" name="Picture 32"/>
-            <wp:cNvGraphicFramePr>
-              <a:graphicFrameLocks noChangeAspect="1"/>
-            </wp:cNvGraphicFramePr>
-            <a:graphic>
-              <a:graphicData uri="http://schemas.openxmlformats.org/drawingml/2006/picture">
-                <pic:pic>
-                  <pic:nvPicPr>
-                    <pic:cNvPr id="0" name="image.png"/>
-                    <pic:cNvPicPr/>
-                  </pic:nvPicPr>
-                  <pic:blipFill>
-                    <a:blip r:embed="rId40"/>
-                    <a:stretch>
-                      <a:fillRect/>
-                    </a:stretch>
-                  </pic:blipFill>
-                  <pic:spPr>
-                    <a:xfrm>
-                      <a:off x="0" y="0"/>
-                      <a:ext cx="1780032" cy="475488"/>
-                    </a:xfrm>
-                    <a:prstGeom prst="rect"/>
-                  </pic:spPr>
-                </pic:pic>
-              </a:graphicData>
-            </a:graphic>
-          </wp:inline>
-        </w:drawing>
-      </w:r>
+      <w:pPr>
+        <w:jc w:val="center"/>
+      </w:pPr>
+      <m:oMath>
+        <m:box>
+          <m:e>
+            <m:r>
+              <m:rPr>
+                <m:sty m:val="i"/>
+              </m:rPr>
+              <m:t>η</m:t>
+            </m:r>
+            <m:r>
+              <m:rPr>
+                <m:sty m:val="p"/>
+              </m:rPr>
+              <m:t>=</m:t>
+            </m:r>
+            <m:f>
+              <m:num>
+                <m:box>
+                  <m:e>
+                    <m:r>
+                      <m:rPr>
+                        <m:sty m:val="i"/>
+                      </m:rPr>
+                      <m:t>I</m:t>
+                    </m:r>
+                    <m:r>
+                      <m:rPr>
+                        <m:sty m:val="i"/>
+                      </m:rPr>
+                      <m:t>P</m:t>
+                    </m:r>
+                    <m:r>
+                      <m:rPr>
+                        <m:sty m:val="p"/>
+                      </m:rPr>
+                      <m:t>−</m:t>
+                    </m:r>
+                    <m:r>
+                      <m:rPr>
+                        <m:sty m:val="i"/>
+                      </m:rPr>
+                      <m:t>E</m:t>
+                    </m:r>
+                    <m:r>
+                      <m:rPr>
+                        <m:sty m:val="i"/>
+                      </m:rPr>
+                      <m:t>A</m:t>
+                    </m:r>
+                  </m:e>
+                </m:box>
+              </m:num>
+              <m:den>
+                <m:box>
+                  <m:e>
+                    <m:r>
+                      <m:rPr>
+                        <m:sty m:val="p"/>
+                      </m:rPr>
+                      <m:t>2</m:t>
+                    </m:r>
+                  </m:e>
+                </m:box>
+              </m:den>
+            </m:f>
+            <m:r>
+              <m:rPr>
+                <m:sty m:val="p"/>
+              </m:rPr>
+              <m:t>=</m:t>
+            </m:r>
+            <m:f>
+              <m:num>
+                <m:box>
+                  <m:e>
+                    <m:sSub>
+                      <m:e>
+                        <m:r>
+                          <m:rPr>
+                            <m:sty m:val="i"/>
+                          </m:rPr>
+                          <m:t>E</m:t>
+                        </m:r>
+                      </m:e>
+                      <m:sub>
+                        <m:box>
+                          <m:e>
+                            <m:r>
+                              <m:rPr>
+                                <m:sty m:val="i"/>
+                              </m:rPr>
+                              <m:t>g</m:t>
+                            </m:r>
+                            <m:r>
+                              <m:rPr>
+                                <m:sty m:val="i"/>
+                              </m:rPr>
+                              <m:t>a</m:t>
+                            </m:r>
+                            <m:r>
+                              <m:rPr>
+                                <m:sty m:val="i"/>
+                              </m:rPr>
+                              <m:t>p</m:t>
+                            </m:r>
+                          </m:e>
+                        </m:box>
+                      </m:sub>
+                    </m:sSub>
+                  </m:e>
+                </m:box>
+              </m:num>
+              <m:den>
+                <m:box>
+                  <m:e>
+                    <m:r>
+                      <m:rPr>
+                        <m:sty m:val="p"/>
+                      </m:rPr>
+                      <m:t>2</m:t>
+                    </m:r>
+                  </m:e>
+                </m:box>
+              </m:den>
+            </m:f>
+          </m:e>
+        </m:box>
+      </m:oMath>
     </w:p>
     <w:p>
       <w:r>
@@ -6546,40 +6865,53 @@
       </w:r>
     </w:p>
     <w:p>
-      <w:r>
-        <w:drawing>
-          <wp:inline xmlns:a="http://schemas.openxmlformats.org/drawingml/2006/main" xmlns:pic="http://schemas.openxmlformats.org/drawingml/2006/picture">
-            <wp:extent cx="707136" cy="445008"/>
-            <wp:docPr id="33" name="Picture 33"/>
-            <wp:cNvGraphicFramePr>
-              <a:graphicFrameLocks noChangeAspect="1"/>
-            </wp:cNvGraphicFramePr>
-            <a:graphic>
-              <a:graphicData uri="http://schemas.openxmlformats.org/drawingml/2006/picture">
-                <pic:pic>
-                  <pic:nvPicPr>
-                    <pic:cNvPr id="0" name="image.png"/>
-                    <pic:cNvPicPr/>
-                  </pic:nvPicPr>
-                  <pic:blipFill>
-                    <a:blip r:embed="rId41"/>
-                    <a:stretch>
-                      <a:fillRect/>
-                    </a:stretch>
-                  </pic:blipFill>
-                  <pic:spPr>
-                    <a:xfrm>
-                      <a:off x="0" y="0"/>
-                      <a:ext cx="707136" cy="445008"/>
-                    </a:xfrm>
-                    <a:prstGeom prst="rect"/>
-                  </pic:spPr>
-                </pic:pic>
-              </a:graphicData>
-            </a:graphic>
-          </wp:inline>
-        </w:drawing>
-      </w:r>
+      <w:pPr>
+        <w:jc w:val="center"/>
+      </w:pPr>
+      <m:oMath>
+        <m:box>
+          <m:e>
+            <m:r>
+              <m:rPr>
+                <m:sty m:val="i"/>
+              </m:rPr>
+              <m:t>σ</m:t>
+            </m:r>
+            <m:r>
+              <m:rPr>
+                <m:sty m:val="p"/>
+              </m:rPr>
+              <m:t>=</m:t>
+            </m:r>
+            <m:f>
+              <m:num>
+                <m:box>
+                  <m:e>
+                    <m:r>
+                      <m:rPr>
+                        <m:sty m:val="p"/>
+                      </m:rPr>
+                      <m:t>1</m:t>
+                    </m:r>
+                  </m:e>
+                </m:box>
+              </m:num>
+              <m:den>
+                <m:box>
+                  <m:e>
+                    <m:r>
+                      <m:rPr>
+                        <m:sty m:val="i"/>
+                      </m:rPr>
+                      <m:t>η</m:t>
+                    </m:r>
+                  </m:e>
+                </m:box>
+              </m:den>
+            </m:f>
+          </m:e>
+        </m:box>
+      </m:oMath>
     </w:p>
     <w:p>
       <w:r>
@@ -6597,40 +6929,42 @@
       </w:r>
     </w:p>
     <w:p>
-      <w:r>
-        <w:drawing>
-          <wp:inline xmlns:a="http://schemas.openxmlformats.org/drawingml/2006/main" xmlns:pic="http://schemas.openxmlformats.org/drawingml/2006/picture">
-            <wp:extent cx="938784" cy="371856"/>
-            <wp:docPr id="34" name="Picture 34"/>
-            <wp:cNvGraphicFramePr>
-              <a:graphicFrameLocks noChangeAspect="1"/>
-            </wp:cNvGraphicFramePr>
-            <a:graphic>
-              <a:graphicData uri="http://schemas.openxmlformats.org/drawingml/2006/picture">
-                <pic:pic>
-                  <pic:nvPicPr>
-                    <pic:cNvPr id="0" name="image.png"/>
-                    <pic:cNvPicPr/>
-                  </pic:nvPicPr>
-                  <pic:blipFill>
-                    <a:blip r:embed="rId42"/>
-                    <a:stretch>
-                      <a:fillRect/>
-                    </a:stretch>
-                  </pic:blipFill>
-                  <pic:spPr>
-                    <a:xfrm>
-                      <a:off x="0" y="0"/>
-                      <a:ext cx="938784" cy="371856"/>
-                    </a:xfrm>
-                    <a:prstGeom prst="rect"/>
-                  </pic:spPr>
-                </pic:pic>
-              </a:graphicData>
-            </a:graphic>
-          </wp:inline>
-        </w:drawing>
-      </w:r>
+      <w:pPr>
+        <w:jc w:val="center"/>
+      </w:pPr>
+      <m:oMath>
+        <m:box>
+          <m:e>
+            <m:r>
+              <m:rPr>
+                <m:sty m:val="i"/>
+              </m:rPr>
+              <m:t>μ</m:t>
+            </m:r>
+            <m:r>
+              <m:rPr>
+                <m:sty m:val="p"/>
+              </m:rPr>
+              <m:t>=</m:t>
+            </m:r>
+            <m:r>
+              <m:rPr>
+                <m:sty m:val="p"/>
+              </m:rPr>
+              <m:t>−</m:t>
+            </m:r>
+            <m:r>
+              <m:t/>
+            </m:r>
+            <m:r>
+              <m:rPr>
+                <m:sty m:val="i"/>
+              </m:rPr>
+              <m:t>χ</m:t>
+            </m:r>
+          </m:e>
+        </m:box>
+      </m:oMath>
     </w:p>
     <w:p>
       <w:r>
@@ -6648,40 +6982,78 @@
       </w:r>
     </w:p>
     <w:p>
-      <w:r>
-        <w:drawing>
-          <wp:inline xmlns:a="http://schemas.openxmlformats.org/drawingml/2006/main" xmlns:pic="http://schemas.openxmlformats.org/drawingml/2006/picture">
-            <wp:extent cx="877824" cy="530352"/>
-            <wp:docPr id="35" name="Picture 35"/>
-            <wp:cNvGraphicFramePr>
-              <a:graphicFrameLocks noChangeAspect="1"/>
-            </wp:cNvGraphicFramePr>
-            <a:graphic>
-              <a:graphicData uri="http://schemas.openxmlformats.org/drawingml/2006/picture">
-                <pic:pic>
-                  <pic:nvPicPr>
-                    <pic:cNvPr id="0" name="image.png"/>
-                    <pic:cNvPicPr/>
-                  </pic:nvPicPr>
-                  <pic:blipFill>
-                    <a:blip r:embed="rId43"/>
-                    <a:stretch>
-                      <a:fillRect/>
-                    </a:stretch>
-                  </pic:blipFill>
-                  <pic:spPr>
-                    <a:xfrm>
-                      <a:off x="0" y="0"/>
-                      <a:ext cx="877824" cy="530352"/>
-                    </a:xfrm>
-                    <a:prstGeom prst="rect"/>
-                  </pic:spPr>
-                </pic:pic>
-              </a:graphicData>
-            </a:graphic>
-          </wp:inline>
-        </w:drawing>
-      </w:r>
+      <w:pPr>
+        <w:jc w:val="center"/>
+      </w:pPr>
+      <m:oMath>
+        <m:box>
+          <m:e>
+            <m:r>
+              <m:rPr>
+                <m:sty m:val="i"/>
+              </m:rPr>
+              <m:t>ω</m:t>
+            </m:r>
+            <m:r>
+              <m:rPr>
+                <m:sty m:val="p"/>
+              </m:rPr>
+              <m:t>=</m:t>
+            </m:r>
+            <m:f>
+              <m:num>
+                <m:box>
+                  <m:e>
+                    <m:sSup>
+                      <m:e>
+                        <m:r>
+                          <m:rPr>
+                            <m:sty m:val="i"/>
+                          </m:rPr>
+                          <m:t>μ</m:t>
+                        </m:r>
+                      </m:e>
+                      <m:sup>
+                        <m:box>
+                          <m:e>
+                            <m:r>
+                              <m:rPr>
+                                <m:sty m:val="p"/>
+                              </m:rPr>
+                              <m:t>2</m:t>
+                            </m:r>
+                          </m:e>
+                        </m:box>
+                      </m:sup>
+                    </m:sSup>
+                  </m:e>
+                </m:box>
+              </m:num>
+              <m:den>
+                <m:box>
+                  <m:e>
+                    <m:r>
+                      <m:rPr>
+                        <m:sty m:val="p"/>
+                      </m:rPr>
+                      <m:t>2</m:t>
+                    </m:r>
+                    <m:r>
+                      <m:t/>
+                    </m:r>
+                    <m:r>
+                      <m:rPr>
+                        <m:sty m:val="i"/>
+                      </m:rPr>
+                      <m:t>η</m:t>
+                    </m:r>
+                  </m:e>
+                </m:box>
+              </m:den>
+            </m:f>
+          </m:e>
+        </m:box>
+      </m:oMath>
     </w:p>
     <w:p>
       <w:r>
@@ -6699,40 +7071,184 @@
       </w:r>
     </w:p>
     <w:p>
-      <w:r>
-        <w:drawing>
-          <wp:inline xmlns:a="http://schemas.openxmlformats.org/drawingml/2006/main" xmlns:pic="http://schemas.openxmlformats.org/drawingml/2006/picture">
-            <wp:extent cx="1761744" cy="499871"/>
-            <wp:docPr id="36" name="Picture 36"/>
-            <wp:cNvGraphicFramePr>
-              <a:graphicFrameLocks noChangeAspect="1"/>
-            </wp:cNvGraphicFramePr>
-            <a:graphic>
-              <a:graphicData uri="http://schemas.openxmlformats.org/drawingml/2006/picture">
-                <pic:pic>
-                  <pic:nvPicPr>
-                    <pic:cNvPr id="0" name="image.png"/>
-                    <pic:cNvPicPr/>
-                  </pic:nvPicPr>
-                  <pic:blipFill>
-                    <a:blip r:embed="rId44"/>
-                    <a:stretch>
-                      <a:fillRect/>
-                    </a:stretch>
-                  </pic:blipFill>
-                  <pic:spPr>
-                    <a:xfrm>
-                      <a:off x="0" y="0"/>
-                      <a:ext cx="1761744" cy="499871"/>
-                    </a:xfrm>
-                    <a:prstGeom prst="rect"/>
-                  </pic:spPr>
-                </pic:pic>
-              </a:graphicData>
-            </a:graphic>
-          </wp:inline>
-        </w:drawing>
-      </w:r>
+      <w:pPr>
+        <w:jc w:val="center"/>
+      </w:pPr>
+      <m:oMath>
+        <m:box>
+          <m:e>
+            <m:r>
+              <m:rPr>
+                <m:sty m:val="i"/>
+              </m:rPr>
+              <m:t>Δ</m:t>
+            </m:r>
+            <m:r>
+              <m:rPr>
+                <m:sty m:val="i"/>
+              </m:rPr>
+              <m:t>N</m:t>
+            </m:r>
+            <m:r>
+              <m:rPr>
+                <m:sty m:val="p"/>
+              </m:rPr>
+              <m:t>=</m:t>
+            </m:r>
+            <m:f>
+              <m:num>
+                <m:box>
+                  <m:e>
+                    <m:sSub>
+                      <m:e>
+                        <m:r>
+                          <m:rPr>
+                            <m:sty m:val="i"/>
+                          </m:rPr>
+                          <m:t>Φ</m:t>
+                        </m:r>
+                      </m:e>
+                      <m:sub>
+                        <m:box>
+                          <m:e>
+                            <m:r>
+                              <m:rPr>
+                                <m:sty m:val="i"/>
+                              </m:rPr>
+                              <m:t>m</m:t>
+                            </m:r>
+                            <m:r>
+                              <m:rPr>
+                                <m:sty m:val="i"/>
+                              </m:rPr>
+                              <m:t>e</m:t>
+                            </m:r>
+                            <m:r>
+                              <m:rPr>
+                                <m:sty m:val="i"/>
+                              </m:rPr>
+                              <m:t>t</m:t>
+                            </m:r>
+                            <m:r>
+                              <m:rPr>
+                                <m:sty m:val="i"/>
+                              </m:rPr>
+                              <m:t>a</m:t>
+                            </m:r>
+                            <m:r>
+                              <m:rPr>
+                                <m:sty m:val="i"/>
+                              </m:rPr>
+                              <m:t>l</m:t>
+                            </m:r>
+                          </m:e>
+                        </m:box>
+                      </m:sub>
+                    </m:sSub>
+                    <m:r>
+                      <m:rPr>
+                        <m:sty m:val="p"/>
+                      </m:rPr>
+                      <m:t>−</m:t>
+                    </m:r>
+                    <m:r>
+                      <m:rPr>
+                        <m:sty m:val="i"/>
+                      </m:rPr>
+                      <m:t>χ</m:t>
+                    </m:r>
+                  </m:e>
+                </m:box>
+              </m:num>
+              <m:den>
+                <m:box>
+                  <m:e>
+                    <m:r>
+                      <m:rPr>
+                        <m:sty m:val="p"/>
+                      </m:rPr>
+                      <m:t>2</m:t>
+                    </m:r>
+                    <m:r>
+                      <m:t/>
+                    </m:r>
+                    <m:r>
+                      <m:rPr>
+                        <m:sty m:val="p"/>
+                      </m:rPr>
+                      <m:t>(</m:t>
+                    </m:r>
+                    <m:sSub>
+                      <m:e>
+                        <m:r>
+                          <m:rPr>
+                            <m:sty m:val="i"/>
+                          </m:rPr>
+                          <m:t>η</m:t>
+                        </m:r>
+                      </m:e>
+                      <m:sub>
+                        <m:box>
+                          <m:e>
+                            <m:r>
+                              <m:rPr>
+                                <m:sty m:val="i"/>
+                              </m:rPr>
+                              <m:t>m</m:t>
+                            </m:r>
+                            <m:r>
+                              <m:rPr>
+                                <m:sty m:val="i"/>
+                              </m:rPr>
+                              <m:t>e</m:t>
+                            </m:r>
+                            <m:r>
+                              <m:rPr>
+                                <m:sty m:val="i"/>
+                              </m:rPr>
+                              <m:t>t</m:t>
+                            </m:r>
+                            <m:r>
+                              <m:rPr>
+                                <m:sty m:val="i"/>
+                              </m:rPr>
+                              <m:t>a</m:t>
+                            </m:r>
+                            <m:r>
+                              <m:rPr>
+                                <m:sty m:val="i"/>
+                              </m:rPr>
+                              <m:t>l</m:t>
+                            </m:r>
+                          </m:e>
+                        </m:box>
+                      </m:sub>
+                    </m:sSub>
+                    <m:r>
+                      <m:rPr>
+                        <m:sty m:val="p"/>
+                      </m:rPr>
+                      <m:t>+</m:t>
+                    </m:r>
+                    <m:r>
+                      <m:rPr>
+                        <m:sty m:val="i"/>
+                      </m:rPr>
+                      <m:t>η</m:t>
+                    </m:r>
+                    <m:r>
+                      <m:rPr>
+                        <m:sty m:val="p"/>
+                      </m:rPr>
+                      <m:t>)</m:t>
+                    </m:r>
+                  </m:e>
+                </m:box>
+              </m:den>
+            </m:f>
+          </m:e>
+        </m:box>
+      </m:oMath>
     </w:p>
     <w:p>
       <w:r>
@@ -6750,40 +7266,102 @@
       </w:r>
     </w:p>
     <w:p>
-      <w:r>
-        <w:drawing>
-          <wp:inline xmlns:a="http://schemas.openxmlformats.org/drawingml/2006/main" xmlns:pic="http://schemas.openxmlformats.org/drawingml/2006/picture">
-            <wp:extent cx="1475232" cy="438912"/>
-            <wp:docPr id="37" name="Picture 37"/>
-            <wp:cNvGraphicFramePr>
-              <a:graphicFrameLocks noChangeAspect="1"/>
-            </wp:cNvGraphicFramePr>
-            <a:graphic>
-              <a:graphicData uri="http://schemas.openxmlformats.org/drawingml/2006/picture">
-                <pic:pic>
-                  <pic:nvPicPr>
-                    <pic:cNvPr id="0" name="image.png"/>
-                    <pic:cNvPicPr/>
-                  </pic:nvPicPr>
-                  <pic:blipFill>
-                    <a:blip r:embed="rId45"/>
-                    <a:stretch>
-                      <a:fillRect/>
-                    </a:stretch>
-                  </pic:blipFill>
-                  <pic:spPr>
-                    <a:xfrm>
-                      <a:off x="0" y="0"/>
-                      <a:ext cx="1475232" cy="438912"/>
-                    </a:xfrm>
-                    <a:prstGeom prst="rect"/>
-                  </pic:spPr>
-                </pic:pic>
-              </a:graphicData>
-            </a:graphic>
-          </wp:inline>
-        </w:drawing>
-      </w:r>
+      <w:pPr>
+        <w:jc w:val="center"/>
+      </w:pPr>
+      <m:oMath>
+        <m:box>
+          <m:e>
+            <m:r>
+              <m:rPr>
+                <m:sty m:val="i"/>
+              </m:rPr>
+              <m:t>Δ</m:t>
+            </m:r>
+            <m:sSub>
+              <m:e>
+                <m:r>
+                  <m:rPr>
+                    <m:sty m:val="i"/>
+                  </m:rPr>
+                  <m:t>E</m:t>
+                </m:r>
+              </m:e>
+              <m:sub>
+                <m:box>
+                  <m:e>
+                    <m:r>
+                      <m:rPr>
+                        <m:sty m:val="i"/>
+                      </m:rPr>
+                      <m:t>b</m:t>
+                    </m:r>
+                    <m:r>
+                      <m:rPr>
+                        <m:sty m:val="i"/>
+                      </m:rPr>
+                      <m:t>a</m:t>
+                    </m:r>
+                    <m:r>
+                      <m:rPr>
+                        <m:sty m:val="i"/>
+                      </m:rPr>
+                      <m:t>c</m:t>
+                    </m:r>
+                    <m:r>
+                      <m:rPr>
+                        <m:sty m:val="i"/>
+                      </m:rPr>
+                      <m:t>k</m:t>
+                    </m:r>
+                  </m:e>
+                </m:box>
+              </m:sub>
+            </m:sSub>
+            <m:r>
+              <m:rPr>
+                <m:sty m:val="p"/>
+              </m:rPr>
+              <m:t>=</m:t>
+            </m:r>
+            <m:r>
+              <m:rPr>
+                <m:sty m:val="p"/>
+              </m:rPr>
+              <m:t>−</m:t>
+            </m:r>
+            <m:r>
+              <m:t/>
+            </m:r>
+            <m:f>
+              <m:num>
+                <m:box>
+                  <m:e>
+                    <m:r>
+                      <m:rPr>
+                        <m:sty m:val="i"/>
+                      </m:rPr>
+                      <m:t>η</m:t>
+                    </m:r>
+                  </m:e>
+                </m:box>
+              </m:num>
+              <m:den>
+                <m:box>
+                  <m:e>
+                    <m:r>
+                      <m:rPr>
+                        <m:sty m:val="p"/>
+                      </m:rPr>
+                      <m:t>4</m:t>
+                    </m:r>
+                  </m:e>
+                </m:box>
+              </m:den>
+            </m:f>
+          </m:e>
+        </m:box>
+      </m:oMath>
     </w:p>
     <w:p>
       <w:r>
@@ -6809,40 +7387,153 @@
       </w:r>
     </w:p>
     <w:p>
-      <w:r>
-        <w:drawing>
-          <wp:inline xmlns:a="http://schemas.openxmlformats.org/drawingml/2006/main" xmlns:pic="http://schemas.openxmlformats.org/drawingml/2006/picture">
-            <wp:extent cx="2560320" cy="402336"/>
-            <wp:docPr id="38" name="Picture 38"/>
-            <wp:cNvGraphicFramePr>
-              <a:graphicFrameLocks noChangeAspect="1"/>
-            </wp:cNvGraphicFramePr>
-            <a:graphic>
-              <a:graphicData uri="http://schemas.openxmlformats.org/drawingml/2006/picture">
-                <pic:pic>
-                  <pic:nvPicPr>
-                    <pic:cNvPr id="0" name="image.png"/>
-                    <pic:cNvPicPr/>
-                  </pic:nvPicPr>
-                  <pic:blipFill>
-                    <a:blip r:embed="rId46"/>
-                    <a:stretch>
-                      <a:fillRect/>
-                    </a:stretch>
-                  </pic:blipFill>
-                  <pic:spPr>
-                    <a:xfrm>
-                      <a:off x="0" y="0"/>
-                      <a:ext cx="2560320" cy="402336"/>
-                    </a:xfrm>
-                    <a:prstGeom prst="rect"/>
-                  </pic:spPr>
-                </pic:pic>
-              </a:graphicData>
-            </a:graphic>
-          </wp:inline>
-        </w:drawing>
-      </w:r>
+      <w:pPr>
+        <w:jc w:val="center"/>
+      </w:pPr>
+      <m:oMath>
+        <m:box>
+          <m:e>
+            <m:sSubSup>
+              <m:e>
+                <m:r>
+                  <m:rPr>
+                    <m:sty m:val="i"/>
+                  </m:rPr>
+                  <m:t>f</m:t>
+                </m:r>
+              </m:e>
+              <m:sub>
+                <m:box>
+                  <m:e>
+                    <m:r>
+                      <m:rPr>
+                        <m:sty m:val="i"/>
+                      </m:rPr>
+                      <m:t>k</m:t>
+                    </m:r>
+                  </m:e>
+                </m:box>
+              </m:sub>
+              <m:sup>
+                <m:box>
+                  <m:e>
+                    <m:r>
+                      <m:rPr>
+                        <m:sty m:val="p"/>
+                      </m:rPr>
+                      <m:t>−</m:t>
+                    </m:r>
+                  </m:e>
+                </m:box>
+              </m:sup>
+            </m:sSubSup>
+            <m:r>
+              <m:rPr>
+                <m:sty m:val="p"/>
+              </m:rPr>
+              <m:t>=</m:t>
+            </m:r>
+            <m:sSub>
+              <m:e>
+                <m:r>
+                  <m:rPr>
+                    <m:sty m:val="i"/>
+                  </m:rPr>
+                  <m:t>q</m:t>
+                </m:r>
+              </m:e>
+              <m:sub>
+                <m:box>
+                  <m:e>
+                    <m:r>
+                      <m:rPr>
+                        <m:sty m:val="i"/>
+                      </m:rPr>
+                      <m:t>k</m:t>
+                    </m:r>
+                  </m:e>
+                </m:box>
+              </m:sub>
+            </m:sSub>
+            <m:r>
+              <m:rPr>
+                <m:sty m:val="p"/>
+              </m:rPr>
+              <m:t>(</m:t>
+            </m:r>
+            <m:r>
+              <m:rPr>
+                <m:sty m:val="i"/>
+              </m:rPr>
+              <m:t>N</m:t>
+            </m:r>
+            <m:r>
+              <m:rPr>
+                <m:sty m:val="p"/>
+              </m:rPr>
+              <m:t>−</m:t>
+            </m:r>
+            <m:r>
+              <m:rPr>
+                <m:sty m:val="p"/>
+              </m:rPr>
+              <m:t>1</m:t>
+            </m:r>
+            <m:r>
+              <m:rPr>
+                <m:sty m:val="p"/>
+              </m:rPr>
+              <m:t>)</m:t>
+            </m:r>
+            <m:r>
+              <m:rPr>
+                <m:sty m:val="p"/>
+              </m:rPr>
+              <m:t>−</m:t>
+            </m:r>
+            <m:sSub>
+              <m:e>
+                <m:r>
+                  <m:rPr>
+                    <m:sty m:val="i"/>
+                  </m:rPr>
+                  <m:t>q</m:t>
+                </m:r>
+              </m:e>
+              <m:sub>
+                <m:box>
+                  <m:e>
+                    <m:r>
+                      <m:rPr>
+                        <m:sty m:val="i"/>
+                      </m:rPr>
+                      <m:t>k</m:t>
+                    </m:r>
+                  </m:e>
+                </m:box>
+              </m:sub>
+            </m:sSub>
+            <m:r>
+              <m:rPr>
+                <m:sty m:val="p"/>
+              </m:rPr>
+              <m:t>(</m:t>
+            </m:r>
+            <m:r>
+              <m:rPr>
+                <m:sty m:val="i"/>
+              </m:rPr>
+              <m:t>N</m:t>
+            </m:r>
+            <m:r>
+              <m:rPr>
+                <m:sty m:val="p"/>
+              </m:rPr>
+              <m:t>)</m:t>
+            </m:r>
+          </m:e>
+        </m:box>
+      </m:oMath>
     </w:p>
     <w:p>
       <w:r>
@@ -6860,40 +7551,153 @@
       </w:r>
     </w:p>
     <w:p>
-      <w:r>
-        <w:drawing>
-          <wp:inline xmlns:a="http://schemas.openxmlformats.org/drawingml/2006/main" xmlns:pic="http://schemas.openxmlformats.org/drawingml/2006/picture">
-            <wp:extent cx="2560320" cy="426720"/>
-            <wp:docPr id="39" name="Picture 39"/>
-            <wp:cNvGraphicFramePr>
-              <a:graphicFrameLocks noChangeAspect="1"/>
-            </wp:cNvGraphicFramePr>
-            <a:graphic>
-              <a:graphicData uri="http://schemas.openxmlformats.org/drawingml/2006/picture">
-                <pic:pic>
-                  <pic:nvPicPr>
-                    <pic:cNvPr id="0" name="image.png"/>
-                    <pic:cNvPicPr/>
-                  </pic:nvPicPr>
-                  <pic:blipFill>
-                    <a:blip r:embed="rId47"/>
-                    <a:stretch>
-                      <a:fillRect/>
-                    </a:stretch>
-                  </pic:blipFill>
-                  <pic:spPr>
-                    <a:xfrm>
-                      <a:off x="0" y="0"/>
-                      <a:ext cx="2560320" cy="426720"/>
-                    </a:xfrm>
-                    <a:prstGeom prst="rect"/>
-                  </pic:spPr>
-                </pic:pic>
-              </a:graphicData>
-            </a:graphic>
-          </wp:inline>
-        </w:drawing>
-      </w:r>
+      <w:pPr>
+        <w:jc w:val="center"/>
+      </w:pPr>
+      <m:oMath>
+        <m:box>
+          <m:e>
+            <m:sSubSup>
+              <m:e>
+                <m:r>
+                  <m:rPr>
+                    <m:sty m:val="i"/>
+                  </m:rPr>
+                  <m:t>f</m:t>
+                </m:r>
+              </m:e>
+              <m:sub>
+                <m:box>
+                  <m:e>
+                    <m:r>
+                      <m:rPr>
+                        <m:sty m:val="i"/>
+                      </m:rPr>
+                      <m:t>k</m:t>
+                    </m:r>
+                  </m:e>
+                </m:box>
+              </m:sub>
+              <m:sup>
+                <m:box>
+                  <m:e>
+                    <m:r>
+                      <m:rPr>
+                        <m:sty m:val="p"/>
+                      </m:rPr>
+                      <m:t>+</m:t>
+                    </m:r>
+                  </m:e>
+                </m:box>
+              </m:sup>
+            </m:sSubSup>
+            <m:r>
+              <m:rPr>
+                <m:sty m:val="p"/>
+              </m:rPr>
+              <m:t>=</m:t>
+            </m:r>
+            <m:sSub>
+              <m:e>
+                <m:r>
+                  <m:rPr>
+                    <m:sty m:val="i"/>
+                  </m:rPr>
+                  <m:t>q</m:t>
+                </m:r>
+              </m:e>
+              <m:sub>
+                <m:box>
+                  <m:e>
+                    <m:r>
+                      <m:rPr>
+                        <m:sty m:val="i"/>
+                      </m:rPr>
+                      <m:t>k</m:t>
+                    </m:r>
+                  </m:e>
+                </m:box>
+              </m:sub>
+            </m:sSub>
+            <m:r>
+              <m:rPr>
+                <m:sty m:val="p"/>
+              </m:rPr>
+              <m:t>(</m:t>
+            </m:r>
+            <m:r>
+              <m:rPr>
+                <m:sty m:val="i"/>
+              </m:rPr>
+              <m:t>N</m:t>
+            </m:r>
+            <m:r>
+              <m:rPr>
+                <m:sty m:val="p"/>
+              </m:rPr>
+              <m:t>)</m:t>
+            </m:r>
+            <m:r>
+              <m:rPr>
+                <m:sty m:val="p"/>
+              </m:rPr>
+              <m:t>−</m:t>
+            </m:r>
+            <m:sSub>
+              <m:e>
+                <m:r>
+                  <m:rPr>
+                    <m:sty m:val="i"/>
+                  </m:rPr>
+                  <m:t>q</m:t>
+                </m:r>
+              </m:e>
+              <m:sub>
+                <m:box>
+                  <m:e>
+                    <m:r>
+                      <m:rPr>
+                        <m:sty m:val="i"/>
+                      </m:rPr>
+                      <m:t>k</m:t>
+                    </m:r>
+                  </m:e>
+                </m:box>
+              </m:sub>
+            </m:sSub>
+            <m:r>
+              <m:rPr>
+                <m:sty m:val="p"/>
+              </m:rPr>
+              <m:t>(</m:t>
+            </m:r>
+            <m:r>
+              <m:rPr>
+                <m:sty m:val="i"/>
+              </m:rPr>
+              <m:t>N</m:t>
+            </m:r>
+            <m:r>
+              <m:rPr>
+                <m:sty m:val="p"/>
+              </m:rPr>
+              <m:t>+</m:t>
+            </m:r>
+            <m:r>
+              <m:rPr>
+                <m:sty m:val="p"/>
+              </m:rPr>
+              <m:t>1</m:t>
+            </m:r>
+            <m:r>
+              <m:rPr>
+                <m:sty m:val="p"/>
+              </m:rPr>
+              <m:t>)</m:t>
+            </m:r>
+          </m:e>
+        </m:box>
+      </m:oMath>
     </w:p>
     <w:p>
       <w:r>
@@ -6911,40 +7715,123 @@
       </w:r>
     </w:p>
     <w:p>
-      <w:r>
-        <w:drawing>
-          <wp:inline xmlns:a="http://schemas.openxmlformats.org/drawingml/2006/main" xmlns:pic="http://schemas.openxmlformats.org/drawingml/2006/picture">
-            <wp:extent cx="1524000" cy="426720"/>
-            <wp:docPr id="40" name="Picture 40"/>
-            <wp:cNvGraphicFramePr>
-              <a:graphicFrameLocks noChangeAspect="1"/>
-            </wp:cNvGraphicFramePr>
-            <a:graphic>
-              <a:graphicData uri="http://schemas.openxmlformats.org/drawingml/2006/picture">
-                <pic:pic>
-                  <pic:nvPicPr>
-                    <pic:cNvPr id="0" name="image.png"/>
-                    <pic:cNvPicPr/>
-                  </pic:nvPicPr>
-                  <pic:blipFill>
-                    <a:blip r:embed="rId48"/>
-                    <a:stretch>
-                      <a:fillRect/>
-                    </a:stretch>
-                  </pic:blipFill>
-                  <pic:spPr>
-                    <a:xfrm>
-                      <a:off x="0" y="0"/>
-                      <a:ext cx="1524000" cy="426720"/>
-                    </a:xfrm>
-                    <a:prstGeom prst="rect"/>
-                  </pic:spPr>
-                </pic:pic>
-              </a:graphicData>
-            </a:graphic>
-          </wp:inline>
-        </w:drawing>
-      </w:r>
+      <w:pPr>
+        <w:jc w:val="center"/>
+      </w:pPr>
+      <m:oMath>
+        <m:box>
+          <m:e>
+            <m:r>
+              <m:rPr>
+                <m:sty m:val="i"/>
+              </m:rPr>
+              <m:t>Δ</m:t>
+            </m:r>
+            <m:sSub>
+              <m:e>
+                <m:r>
+                  <m:rPr>
+                    <m:sty m:val="i"/>
+                  </m:rPr>
+                  <m:t>f</m:t>
+                </m:r>
+              </m:e>
+              <m:sub>
+                <m:box>
+                  <m:e>
+                    <m:r>
+                      <m:rPr>
+                        <m:sty m:val="i"/>
+                      </m:rPr>
+                      <m:t>k</m:t>
+                    </m:r>
+                  </m:e>
+                </m:box>
+              </m:sub>
+            </m:sSub>
+            <m:r>
+              <m:rPr>
+                <m:sty m:val="p"/>
+              </m:rPr>
+              <m:t>=</m:t>
+            </m:r>
+            <m:sSubSup>
+              <m:e>
+                <m:r>
+                  <m:rPr>
+                    <m:sty m:val="i"/>
+                  </m:rPr>
+                  <m:t>f</m:t>
+                </m:r>
+              </m:e>
+              <m:sub>
+                <m:box>
+                  <m:e>
+                    <m:r>
+                      <m:rPr>
+                        <m:sty m:val="i"/>
+                      </m:rPr>
+                      <m:t>k</m:t>
+                    </m:r>
+                  </m:e>
+                </m:box>
+              </m:sub>
+              <m:sup>
+                <m:box>
+                  <m:e>
+                    <m:r>
+                      <m:rPr>
+                        <m:sty m:val="p"/>
+                      </m:rPr>
+                      <m:t>+</m:t>
+                    </m:r>
+                  </m:e>
+                </m:box>
+              </m:sup>
+            </m:sSubSup>
+            <m:r>
+              <m:rPr>
+                <m:sty m:val="p"/>
+              </m:rPr>
+              <m:t>−</m:t>
+            </m:r>
+            <m:sSubSup>
+              <m:e>
+                <m:r>
+                  <m:rPr>
+                    <m:sty m:val="i"/>
+                  </m:rPr>
+                  <m:t>f</m:t>
+                </m:r>
+              </m:e>
+              <m:sub>
+                <m:box>
+                  <m:e>
+                    <m:r>
+                      <m:rPr>
+                        <m:sty m:val="i"/>
+                      </m:rPr>
+                      <m:t>k</m:t>
+                    </m:r>
+                  </m:e>
+                </m:box>
+              </m:sub>
+              <m:sup>
+                <m:box>
+                  <m:e>
+                    <m:r>
+                      <m:rPr>
+                        <m:sty m:val="p"/>
+                      </m:rPr>
+                      <m:t>−</m:t>
+                    </m:r>
+                  </m:e>
+                </m:box>
+              </m:sup>
+            </m:sSubSup>
+          </m:e>
+        </m:box>
+      </m:oMath>
     </w:p>
     <w:p>
       <w:r>
@@ -6970,40 +7857,164 @@
       </w:r>
     </w:p>
     <w:p>
-      <w:r>
-        <w:drawing>
-          <wp:inline xmlns:a="http://schemas.openxmlformats.org/drawingml/2006/main" xmlns:pic="http://schemas.openxmlformats.org/drawingml/2006/picture">
-            <wp:extent cx="1944623" cy="457200"/>
-            <wp:docPr id="41" name="Picture 41"/>
-            <wp:cNvGraphicFramePr>
-              <a:graphicFrameLocks noChangeAspect="1"/>
-            </wp:cNvGraphicFramePr>
-            <a:graphic>
-              <a:graphicData uri="http://schemas.openxmlformats.org/drawingml/2006/picture">
-                <pic:pic>
-                  <pic:nvPicPr>
-                    <pic:cNvPr id="0" name="image.png"/>
-                    <pic:cNvPicPr/>
-                  </pic:nvPicPr>
-                  <pic:blipFill>
-                    <a:blip r:embed="rId49"/>
-                    <a:stretch>
-                      <a:fillRect/>
-                    </a:stretch>
-                  </pic:blipFill>
-                  <pic:spPr>
-                    <a:xfrm>
-                      <a:off x="0" y="0"/>
-                      <a:ext cx="1944623" cy="457200"/>
-                    </a:xfrm>
-                    <a:prstGeom prst="rect"/>
-                  </pic:spPr>
-                </pic:pic>
-              </a:graphicData>
-            </a:graphic>
-          </wp:inline>
-        </w:drawing>
-      </w:r>
+      <w:pPr>
+        <w:jc w:val="center"/>
+      </w:pPr>
+      <m:oMath>
+        <m:box>
+          <m:e>
+            <m:sSub>
+              <m:e>
+                <m:r>
+                  <m:rPr>
+                    <m:sty m:val="i"/>
+                  </m:rPr>
+                  <m:t>f</m:t>
+                </m:r>
+              </m:e>
+              <m:sub>
+                <m:box>
+                  <m:e>
+                    <m:r>
+                      <m:rPr>
+                        <m:sty m:val="i"/>
+                      </m:rPr>
+                      <m:t>p</m:t>
+                    </m:r>
+                    <m:r>
+                      <m:rPr>
+                        <m:sty m:val="i"/>
+                      </m:rPr>
+                      <m:t>r</m:t>
+                    </m:r>
+                    <m:r>
+                      <m:rPr>
+                        <m:sty m:val="i"/>
+                      </m:rPr>
+                      <m:t>o</m:t>
+                    </m:r>
+                    <m:r>
+                      <m:rPr>
+                        <m:sty m:val="i"/>
+                      </m:rPr>
+                      <m:t>t</m:t>
+                    </m:r>
+                  </m:e>
+                </m:box>
+              </m:sub>
+            </m:sSub>
+            <m:r>
+              <m:rPr>
+                <m:sty m:val="p"/>
+              </m:rPr>
+              <m:t>=</m:t>
+            </m:r>
+            <m:f>
+              <m:num>
+                <m:box>
+                  <m:e>
+                    <m:r>
+                      <m:rPr>
+                        <m:sty m:val="p"/>
+                      </m:rPr>
+                      <m:t>1</m:t>
+                    </m:r>
+                  </m:e>
+                </m:box>
+              </m:num>
+              <m:den>
+                <m:box>
+                  <m:e>
+                    <m:r>
+                      <m:rPr>
+                        <m:sty m:val="p"/>
+                      </m:rPr>
+                      <m:t>1</m:t>
+                    </m:r>
+                    <m:r>
+                      <m:rPr>
+                        <m:sty m:val="p"/>
+                      </m:rPr>
+                      <m:t>+</m:t>
+                    </m:r>
+                    <m:sSup>
+                      <m:e>
+                        <m:r>
+                          <m:rPr>
+                            <m:sty m:val="p"/>
+                          </m:rPr>
+                          <m:t>10</m:t>
+                        </m:r>
+                      </m:e>
+                      <m:sup>
+                        <m:box>
+                          <m:e>
+                            <m:r>
+                              <m:t/>
+                            </m:r>
+                            <m:r>
+                              <m:rPr>
+                                <m:sty m:val="i"/>
+                              </m:rPr>
+                              <m:t>p</m:t>
+                            </m:r>
+                            <m:r>
+                              <m:rPr>
+                                <m:sty m:val="i"/>
+                              </m:rPr>
+                              <m:t>H</m:t>
+                            </m:r>
+                            <m:r>
+                              <m:rPr>
+                                <m:sty m:val="p"/>
+                              </m:rPr>
+                              <m:t>−</m:t>
+                            </m:r>
+                            <m:r>
+                              <m:rPr>
+                                <m:sty m:val="i"/>
+                              </m:rPr>
+                              <m:t>p</m:t>
+                            </m:r>
+                            <m:sSub>
+                              <m:e>
+                                <m:r>
+                                  <m:rPr>
+                                    <m:sty m:val="i"/>
+                                  </m:rPr>
+                                  <m:t>K</m:t>
+                                </m:r>
+                              </m:e>
+                              <m:sub>
+                                <m:box>
+                                  <m:e>
+                                    <m:r>
+                                      <m:rPr>
+                                        <m:sty m:val="i"/>
+                                      </m:rPr>
+                                      <m:t>a</m:t>
+                                    </m:r>
+                                    <m:r>
+                                      <m:rPr>
+                                        <m:sty m:val="i"/>
+                                      </m:rPr>
+                                      <m:t>H</m:t>
+                                    </m:r>
+                                  </m:e>
+                                </m:box>
+                              </m:sub>
+                            </m:sSub>
+                          </m:e>
+                        </m:box>
+                      </m:sup>
+                    </m:sSup>
+                  </m:e>
+                </m:box>
+              </m:den>
+            </m:f>
+          </m:e>
+        </m:box>
+      </m:oMath>
     </w:p>
     <w:p>
       <w:r>
@@ -7021,40 +8032,142 @@
       </w:r>
     </w:p>
     <w:p>
-      <w:r>
-        <w:drawing>
-          <wp:inline xmlns:a="http://schemas.openxmlformats.org/drawingml/2006/main" xmlns:pic="http://schemas.openxmlformats.org/drawingml/2006/picture">
-            <wp:extent cx="1591056" cy="542544"/>
-            <wp:docPr id="42" name="Picture 42"/>
-            <wp:cNvGraphicFramePr>
-              <a:graphicFrameLocks noChangeAspect="1"/>
-            </wp:cNvGraphicFramePr>
-            <a:graphic>
-              <a:graphicData uri="http://schemas.openxmlformats.org/drawingml/2006/picture">
-                <pic:pic>
-                  <pic:nvPicPr>
-                    <pic:cNvPr id="0" name="image.png"/>
-                    <pic:cNvPicPr/>
-                  </pic:nvPicPr>
-                  <pic:blipFill>
-                    <a:blip r:embed="rId50"/>
-                    <a:stretch>
-                      <a:fillRect/>
-                    </a:stretch>
-                  </pic:blipFill>
-                  <pic:spPr>
-                    <a:xfrm>
-                      <a:off x="0" y="0"/>
-                      <a:ext cx="1591056" cy="542544"/>
-                    </a:xfrm>
-                    <a:prstGeom prst="rect"/>
-                  </pic:spPr>
-                </pic:pic>
-              </a:graphicData>
-            </a:graphic>
-          </wp:inline>
-        </w:drawing>
-      </w:r>
+      <w:pPr>
+        <w:jc w:val="center"/>
+      </w:pPr>
+      <m:oMath>
+        <m:box>
+          <m:e>
+            <m:r>
+              <m:rPr>
+                <m:sty m:val="i"/>
+              </m:rPr>
+              <m:t>p</m:t>
+            </m:r>
+            <m:sSub>
+              <m:e>
+                <m:r>
+                  <m:rPr>
+                    <m:sty m:val="i"/>
+                  </m:rPr>
+                  <m:t>K</m:t>
+                </m:r>
+              </m:e>
+              <m:sub>
+                <m:box>
+                  <m:e>
+                    <m:r>
+                      <m:rPr>
+                        <m:sty m:val="i"/>
+                      </m:rPr>
+                      <m:t>a</m:t>
+                    </m:r>
+                    <m:r>
+                      <m:rPr>
+                        <m:sty m:val="i"/>
+                      </m:rPr>
+                      <m:t>H</m:t>
+                    </m:r>
+                  </m:e>
+                </m:box>
+              </m:sub>
+            </m:sSub>
+            <m:r>
+              <m:rPr>
+                <m:sty m:val="p"/>
+              </m:rPr>
+              <m:t>=</m:t>
+            </m:r>
+            <m:f>
+              <m:num>
+                <m:box>
+                  <m:e>
+                    <m:r>
+                      <m:rPr>
+                        <m:sty m:val="i"/>
+                      </m:rPr>
+                      <m:t>Δ</m:t>
+                    </m:r>
+                    <m:sSubSup>
+                      <m:e>
+                        <m:r>
+                          <m:rPr>
+                            <m:sty m:val="i"/>
+                          </m:rPr>
+                          <m:t>G</m:t>
+                        </m:r>
+                      </m:e>
+                      <m:sub>
+                        <m:box>
+                          <m:e>
+                            <m:r>
+                              <m:rPr>
+                                <m:sty m:val="i"/>
+                              </m:rPr>
+                              <m:t>a</m:t>
+                            </m:r>
+                            <m:r>
+                              <m:rPr>
+                                <m:sty m:val="i"/>
+                              </m:rPr>
+                              <m:t>q</m:t>
+                            </m:r>
+                          </m:e>
+                        </m:box>
+                      </m:sub>
+                      <m:sup>
+                        <m:box>
+                          <m:e>
+                            <m:r>
+                              <m:rPr>
+                                <m:sty m:val="p"/>
+                              </m:rPr>
+                              <m:t>*</m:t>
+                            </m:r>
+                          </m:e>
+                        </m:box>
+                      </m:sup>
+                    </m:sSubSup>
+                  </m:e>
+                </m:box>
+              </m:num>
+              <m:den>
+                <m:box>
+                  <m:e>
+                    <m:r>
+                      <m:rPr>
+                        <m:sty m:val="i"/>
+                      </m:rPr>
+                      <m:t>R</m:t>
+                    </m:r>
+                    <m:r>
+                      <m:rPr>
+                        <m:sty m:val="i"/>
+                      </m:rPr>
+                      <m:t>T</m:t>
+                    </m:r>
+                    <m:r>
+                      <m:t/>
+                    </m:r>
+                    <m:r>
+                      <m:rPr>
+                        <m:sty m:val="p"/>
+                      </m:rPr>
+                      <m:t>ln</m:t>
+                    </m:r>
+                    <m:r>
+                      <m:rPr>
+                        <m:sty m:val="p"/>
+                      </m:rPr>
+                      <m:t>10</m:t>
+                    </m:r>
+                  </m:e>
+                </m:box>
+              </m:den>
+            </m:f>
+          </m:e>
+        </m:box>
+      </m:oMath>
     </w:p>
     <w:p>
       <w:r>
@@ -7072,40 +8185,237 @@
       </w:r>
     </w:p>
     <w:p>
-      <w:r>
-        <w:drawing>
-          <wp:inline xmlns:a="http://schemas.openxmlformats.org/drawingml/2006/main" xmlns:pic="http://schemas.openxmlformats.org/drawingml/2006/picture">
-            <wp:extent cx="3877056" cy="469392"/>
-            <wp:docPr id="43" name="Picture 43"/>
-            <wp:cNvGraphicFramePr>
-              <a:graphicFrameLocks noChangeAspect="1"/>
-            </wp:cNvGraphicFramePr>
-            <a:graphic>
-              <a:graphicData uri="http://schemas.openxmlformats.org/drawingml/2006/picture">
-                <pic:pic>
-                  <pic:nvPicPr>
-                    <pic:cNvPr id="0" name="image.png"/>
-                    <pic:cNvPicPr/>
-                  </pic:nvPicPr>
-                  <pic:blipFill>
-                    <a:blip r:embed="rId51"/>
-                    <a:stretch>
-                      <a:fillRect/>
-                    </a:stretch>
-                  </pic:blipFill>
-                  <pic:spPr>
-                    <a:xfrm>
-                      <a:off x="0" y="0"/>
-                      <a:ext cx="3877056" cy="469392"/>
-                    </a:xfrm>
-                    <a:prstGeom prst="rect"/>
-                  </pic:spPr>
-                </pic:pic>
-              </a:graphicData>
-            </a:graphic>
-          </wp:inline>
-        </w:drawing>
-      </w:r>
+      <w:pPr>
+        <w:jc w:val="center"/>
+      </w:pPr>
+      <m:oMath>
+        <m:box>
+          <m:e>
+            <m:r>
+              <m:rPr>
+                <m:sty m:val="i"/>
+              </m:rPr>
+              <m:t>Δ</m:t>
+            </m:r>
+            <m:sSubSup>
+              <m:e>
+                <m:r>
+                  <m:rPr>
+                    <m:sty m:val="i"/>
+                  </m:rPr>
+                  <m:t>G</m:t>
+                </m:r>
+              </m:e>
+              <m:sub>
+                <m:box>
+                  <m:e>
+                    <m:r>
+                      <m:rPr>
+                        <m:sty m:val="i"/>
+                      </m:rPr>
+                      <m:t>a</m:t>
+                    </m:r>
+                    <m:r>
+                      <m:rPr>
+                        <m:sty m:val="i"/>
+                      </m:rPr>
+                      <m:t>q</m:t>
+                    </m:r>
+                  </m:e>
+                </m:box>
+              </m:sub>
+              <m:sup>
+                <m:box>
+                  <m:e>
+                    <m:r>
+                      <m:rPr>
+                        <m:sty m:val="p"/>
+                      </m:rPr>
+                      <m:t>*</m:t>
+                    </m:r>
+                  </m:e>
+                </m:box>
+              </m:sup>
+            </m:sSubSup>
+            <m:r>
+              <m:rPr>
+                <m:sty m:val="p"/>
+              </m:rPr>
+              <m:t>=</m:t>
+            </m:r>
+            <m:sSup>
+              <m:e>
+                <m:r>
+                  <m:rPr>
+                    <m:sty m:val="i"/>
+                  </m:rPr>
+                  <m:t>G</m:t>
+                </m:r>
+              </m:e>
+              <m:sup>
+                <m:box>
+                  <m:e>
+                    <m:r>
+                      <m:rPr>
+                        <m:sty m:val="p"/>
+                      </m:rPr>
+                      <m:t>*</m:t>
+                    </m:r>
+                  </m:e>
+                </m:box>
+              </m:sup>
+            </m:sSup>
+            <m:r>
+              <m:rPr>
+                <m:sty m:val="p"/>
+              </m:rPr>
+              <m:t>(</m:t>
+            </m:r>
+            <m:r>
+              <m:rPr>
+                <m:sty m:val="i"/>
+              </m:rPr>
+              <m:t>B</m:t>
+            </m:r>
+            <m:r>
+              <m:rPr>
+                <m:sty m:val="p"/>
+              </m:rPr>
+              <m:t>)</m:t>
+            </m:r>
+            <m:r>
+              <m:rPr>
+                <m:sty m:val="p"/>
+              </m:rPr>
+              <m:t>+</m:t>
+            </m:r>
+            <m:sSup>
+              <m:e>
+                <m:r>
+                  <m:rPr>
+                    <m:sty m:val="i"/>
+                  </m:rPr>
+                  <m:t>G</m:t>
+                </m:r>
+              </m:e>
+              <m:sup>
+                <m:box>
+                  <m:e>
+                    <m:r>
+                      <m:rPr>
+                        <m:sty m:val="p"/>
+                      </m:rPr>
+                      <m:t>*</m:t>
+                    </m:r>
+                  </m:e>
+                </m:box>
+              </m:sup>
+            </m:sSup>
+            <m:r>
+              <m:rPr>
+                <m:sty m:val="p"/>
+              </m:rPr>
+              <m:t>(</m:t>
+            </m:r>
+            <m:sSup>
+              <m:e>
+                <m:r>
+                  <m:rPr>
+                    <m:sty m:val="i"/>
+                  </m:rPr>
+                  <m:t>H</m:t>
+                </m:r>
+              </m:e>
+              <m:sup>
+                <m:box>
+                  <m:e>
+                    <m:r>
+                      <m:rPr>
+                        <m:sty m:val="p"/>
+                      </m:rPr>
+                      <m:t>+</m:t>
+                    </m:r>
+                  </m:e>
+                </m:box>
+              </m:sup>
+            </m:sSup>
+            <m:r>
+              <m:rPr>
+                <m:sty m:val="p"/>
+              </m:rPr>
+              <m:t>)</m:t>
+            </m:r>
+            <m:r>
+              <m:rPr>
+                <m:sty m:val="p"/>
+              </m:rPr>
+              <m:t>−</m:t>
+            </m:r>
+            <m:sSup>
+              <m:e>
+                <m:r>
+                  <m:rPr>
+                    <m:sty m:val="i"/>
+                  </m:rPr>
+                  <m:t>G</m:t>
+                </m:r>
+              </m:e>
+              <m:sup>
+                <m:box>
+                  <m:e>
+                    <m:r>
+                      <m:rPr>
+                        <m:sty m:val="p"/>
+                      </m:rPr>
+                      <m:t>*</m:t>
+                    </m:r>
+                  </m:e>
+                </m:box>
+              </m:sup>
+            </m:sSup>
+            <m:r>
+              <m:rPr>
+                <m:sty m:val="p"/>
+              </m:rPr>
+              <m:t>(</m:t>
+            </m:r>
+            <m:r>
+              <m:rPr>
+                <m:sty m:val="i"/>
+              </m:rPr>
+              <m:t>B</m:t>
+            </m:r>
+            <m:sSup>
+              <m:e>
+                <m:r>
+                  <m:rPr>
+                    <m:sty m:val="i"/>
+                  </m:rPr>
+                  <m:t>H</m:t>
+                </m:r>
+              </m:e>
+              <m:sup>
+                <m:box>
+                  <m:e>
+                    <m:r>
+                      <m:rPr>
+                        <m:sty m:val="p"/>
+                      </m:rPr>
+                      <m:t>+</m:t>
+                    </m:r>
+                  </m:e>
+                </m:box>
+              </m:sup>
+            </m:sSup>
+            <m:r>
+              <m:rPr>
+                <m:sty m:val="p"/>
+              </m:rPr>
+              <m:t>)</m:t>
+            </m:r>
+          </m:e>
+        </m:box>
+      </m:oMath>
     </w:p>
     <w:p>
       <w:r>
@@ -7131,40 +8441,217 @@
       </w:r>
     </w:p>
     <w:p>
-      <w:r>
-        <w:drawing>
-          <wp:inline xmlns:a="http://schemas.openxmlformats.org/drawingml/2006/main" xmlns:pic="http://schemas.openxmlformats.org/drawingml/2006/picture">
-            <wp:extent cx="3505200" cy="377952"/>
-            <wp:docPr id="44" name="Picture 44"/>
-            <wp:cNvGraphicFramePr>
-              <a:graphicFrameLocks noChangeAspect="1"/>
-            </wp:cNvGraphicFramePr>
-            <a:graphic>
-              <a:graphicData uri="http://schemas.openxmlformats.org/drawingml/2006/picture">
-                <pic:pic>
-                  <pic:nvPicPr>
-                    <pic:cNvPr id="0" name="image.png"/>
-                    <pic:cNvPicPr/>
-                  </pic:nvPicPr>
-                  <pic:blipFill>
-                    <a:blip r:embed="rId52"/>
-                    <a:stretch>
-                      <a:fillRect/>
-                    </a:stretch>
-                  </pic:blipFill>
-                  <pic:spPr>
-                    <a:xfrm>
-                      <a:off x="0" y="0"/>
-                      <a:ext cx="3505200" cy="377952"/>
-                    </a:xfrm>
-                    <a:prstGeom prst="rect"/>
-                  </pic:spPr>
-                </pic:pic>
-              </a:graphicData>
-            </a:graphic>
-          </wp:inline>
-        </w:drawing>
-      </w:r>
+      <w:pPr>
+        <w:jc w:val="center"/>
+      </w:pPr>
+      <m:oMath>
+        <m:box>
+          <m:e>
+            <m:sSub>
+              <m:e>
+                <m:r>
+                  <m:rPr>
+                    <m:sty m:val="i"/>
+                  </m:rPr>
+                  <m:t>E</m:t>
+                </m:r>
+              </m:e>
+              <m:sub>
+                <m:box>
+                  <m:e>
+                    <m:r>
+                      <m:rPr>
+                        <m:sty m:val="i"/>
+                      </m:rPr>
+                      <m:t>a</m:t>
+                    </m:r>
+                    <m:r>
+                      <m:rPr>
+                        <m:sty m:val="i"/>
+                      </m:rPr>
+                      <m:t>d</m:t>
+                    </m:r>
+                    <m:r>
+                      <m:rPr>
+                        <m:sty m:val="i"/>
+                      </m:rPr>
+                      <m:t>s</m:t>
+                    </m:r>
+                  </m:e>
+                </m:box>
+              </m:sub>
+            </m:sSub>
+            <m:r>
+              <m:rPr>
+                <m:sty m:val="p"/>
+              </m:rPr>
+              <m:t>=</m:t>
+            </m:r>
+            <m:sSub>
+              <m:e>
+                <m:r>
+                  <m:rPr>
+                    <m:sty m:val="i"/>
+                  </m:rPr>
+                  <m:t>E</m:t>
+                </m:r>
+              </m:e>
+              <m:sub>
+                <m:box>
+                  <m:e>
+                    <m:r>
+                      <m:rPr>
+                        <m:sty m:val="i"/>
+                      </m:rPr>
+                      <m:t>s</m:t>
+                    </m:r>
+                    <m:r>
+                      <m:rPr>
+                        <m:sty m:val="i"/>
+                      </m:rPr>
+                      <m:t>l</m:t>
+                    </m:r>
+                    <m:r>
+                      <m:rPr>
+                        <m:sty m:val="i"/>
+                      </m:rPr>
+                      <m:t>a</m:t>
+                    </m:r>
+                    <m:r>
+                      <m:rPr>
+                        <m:sty m:val="i"/>
+                      </m:rPr>
+                      <m:t>b</m:t>
+                    </m:r>
+                    <m:r>
+                      <m:rPr>
+                        <m:sty m:val="p"/>
+                      </m:rPr>
+                      <m:t>+</m:t>
+                    </m:r>
+                    <m:r>
+                      <m:rPr>
+                        <m:sty m:val="i"/>
+                      </m:rPr>
+                      <m:t>m</m:t>
+                    </m:r>
+                    <m:r>
+                      <m:rPr>
+                        <m:sty m:val="i"/>
+                      </m:rPr>
+                      <m:t>o</m:t>
+                    </m:r>
+                    <m:r>
+                      <m:rPr>
+                        <m:sty m:val="i"/>
+                      </m:rPr>
+                      <m:t>l</m:t>
+                    </m:r>
+                  </m:e>
+                </m:box>
+              </m:sub>
+            </m:sSub>
+            <m:r>
+              <m:rPr>
+                <m:sty m:val="p"/>
+              </m:rPr>
+              <m:t>−</m:t>
+            </m:r>
+            <m:r>
+              <m:rPr>
+                <m:sty m:val="p"/>
+              </m:rPr>
+              <m:t>(</m:t>
+            </m:r>
+            <m:sSub>
+              <m:e>
+                <m:r>
+                  <m:rPr>
+                    <m:sty m:val="i"/>
+                  </m:rPr>
+                  <m:t>E</m:t>
+                </m:r>
+              </m:e>
+              <m:sub>
+                <m:box>
+                  <m:e>
+                    <m:r>
+                      <m:rPr>
+                        <m:sty m:val="i"/>
+                      </m:rPr>
+                      <m:t>s</m:t>
+                    </m:r>
+                    <m:r>
+                      <m:rPr>
+                        <m:sty m:val="i"/>
+                      </m:rPr>
+                      <m:t>l</m:t>
+                    </m:r>
+                    <m:r>
+                      <m:rPr>
+                        <m:sty m:val="i"/>
+                      </m:rPr>
+                      <m:t>a</m:t>
+                    </m:r>
+                    <m:r>
+                      <m:rPr>
+                        <m:sty m:val="i"/>
+                      </m:rPr>
+                      <m:t>b</m:t>
+                    </m:r>
+                  </m:e>
+                </m:box>
+              </m:sub>
+            </m:sSub>
+            <m:r>
+              <m:rPr>
+                <m:sty m:val="p"/>
+              </m:rPr>
+              <m:t>+</m:t>
+            </m:r>
+            <m:sSub>
+              <m:e>
+                <m:r>
+                  <m:rPr>
+                    <m:sty m:val="i"/>
+                  </m:rPr>
+                  <m:t>E</m:t>
+                </m:r>
+              </m:e>
+              <m:sub>
+                <m:box>
+                  <m:e>
+                    <m:r>
+                      <m:rPr>
+                        <m:sty m:val="i"/>
+                      </m:rPr>
+                      <m:t>m</m:t>
+                    </m:r>
+                    <m:r>
+                      <m:rPr>
+                        <m:sty m:val="i"/>
+                      </m:rPr>
+                      <m:t>o</m:t>
+                    </m:r>
+                    <m:r>
+                      <m:rPr>
+                        <m:sty m:val="i"/>
+                      </m:rPr>
+                      <m:t>l</m:t>
+                    </m:r>
+                  </m:e>
+                </m:box>
+              </m:sub>
+            </m:sSub>
+            <m:r>
+              <m:rPr>
+                <m:sty m:val="p"/>
+              </m:rPr>
+              <m:t>)</m:t>
+            </m:r>
+          </m:e>
+        </m:box>
+      </m:oMath>
     </w:p>
     <w:p>
       <w:r>
@@ -7182,40 +8669,200 @@
       </w:r>
     </w:p>
     <w:p>
-      <w:r>
-        <w:drawing>
-          <wp:inline xmlns:a="http://schemas.openxmlformats.org/drawingml/2006/main" xmlns:pic="http://schemas.openxmlformats.org/drawingml/2006/picture">
-            <wp:extent cx="3938016" cy="414528"/>
-            <wp:docPr id="45" name="Picture 45"/>
-            <wp:cNvGraphicFramePr>
-              <a:graphicFrameLocks noChangeAspect="1"/>
-            </wp:cNvGraphicFramePr>
-            <a:graphic>
-              <a:graphicData uri="http://schemas.openxmlformats.org/drawingml/2006/picture">
-                <pic:pic>
-                  <pic:nvPicPr>
-                    <pic:cNvPr id="0" name="image.png"/>
-                    <pic:cNvPicPr/>
-                  </pic:nvPicPr>
-                  <pic:blipFill>
-                    <a:blip r:embed="rId53"/>
-                    <a:stretch>
-                      <a:fillRect/>
-                    </a:stretch>
-                  </pic:blipFill>
-                  <pic:spPr>
-                    <a:xfrm>
-                      <a:off x="0" y="0"/>
-                      <a:ext cx="3938016" cy="414528"/>
-                    </a:xfrm>
-                    <a:prstGeom prst="rect"/>
-                  </pic:spPr>
-                </pic:pic>
-              </a:graphicData>
-            </a:graphic>
-          </wp:inline>
-        </w:drawing>
-      </w:r>
+      <w:pPr>
+        <w:jc w:val="center"/>
+      </w:pPr>
+      <m:oMath>
+        <m:box>
+          <m:e>
+            <m:sSub>
+              <m:e>
+                <m:r>
+                  <m:rPr>
+                    <m:sty m:val="i"/>
+                  </m:rPr>
+                  <m:t>E</m:t>
+                </m:r>
+              </m:e>
+              <m:sub>
+                <m:box>
+                  <m:e>
+                    <m:r>
+                      <m:rPr>
+                        <m:sty m:val="i"/>
+                      </m:rPr>
+                      <m:t>a</m:t>
+                    </m:r>
+                    <m:r>
+                      <m:rPr>
+                        <m:sty m:val="i"/>
+                      </m:rPr>
+                      <m:t>d</m:t>
+                    </m:r>
+                    <m:r>
+                      <m:rPr>
+                        <m:sty m:val="i"/>
+                      </m:rPr>
+                      <m:t>s</m:t>
+                    </m:r>
+                  </m:e>
+                </m:box>
+              </m:sub>
+            </m:sSub>
+            <m:r>
+              <m:rPr>
+                <m:sty m:val="p"/>
+              </m:rPr>
+              <m:t>[</m:t>
+            </m:r>
+            <m:box>
+              <m:e>
+                <m:r>
+                  <m:rPr>
+                    <m:sty m:val="p"/>
+                  </m:rPr>
+                  <m:t>k</m:t>
+                </m:r>
+                <m:r>
+                  <m:rPr>
+                    <m:sty m:val="p"/>
+                  </m:rPr>
+                  <m:t>J</m:t>
+                </m:r>
+                <m:r>
+                  <m:t/>
+                </m:r>
+                <m:r>
+                  <m:rPr>
+                    <m:sty m:val="p"/>
+                  </m:rPr>
+                  <m:t>m</m:t>
+                </m:r>
+                <m:r>
+                  <m:rPr>
+                    <m:sty m:val="p"/>
+                  </m:rPr>
+                  <m:t>o</m:t>
+                </m:r>
+                <m:sSup>
+                  <m:e>
+                    <m:r>
+                      <m:rPr>
+                        <m:sty m:val="p"/>
+                      </m:rPr>
+                      <m:t>l</m:t>
+                    </m:r>
+                  </m:e>
+                  <m:sup>
+                    <m:box>
+                      <m:e>
+                        <m:r>
+                          <m:rPr>
+                            <m:sty m:val="p"/>
+                          </m:rPr>
+                          <m:t>−</m:t>
+                        </m:r>
+                        <m:r>
+                          <m:rPr>
+                            <m:sty m:val="p"/>
+                          </m:rPr>
+                          <m:t>1</m:t>
+                        </m:r>
+                      </m:e>
+                    </m:box>
+                  </m:sup>
+                </m:sSup>
+              </m:e>
+            </m:box>
+            <m:r>
+              <m:rPr>
+                <m:sty m:val="p"/>
+              </m:rPr>
+              <m:t>]</m:t>
+            </m:r>
+            <m:r>
+              <m:rPr>
+                <m:sty m:val="p"/>
+              </m:rPr>
+              <m:t>=</m:t>
+            </m:r>
+            <m:r>
+              <m:rPr>
+                <m:sty m:val="p"/>
+              </m:rPr>
+              <m:t>96.485</m:t>
+            </m:r>
+            <m:r>
+              <m:rPr>
+                <m:sty m:val="p"/>
+              </m:rPr>
+              <m:t>×</m:t>
+            </m:r>
+            <m:sSub>
+              <m:e>
+                <m:r>
+                  <m:rPr>
+                    <m:sty m:val="i"/>
+                  </m:rPr>
+                  <m:t>E</m:t>
+                </m:r>
+              </m:e>
+              <m:sub>
+                <m:box>
+                  <m:e>
+                    <m:r>
+                      <m:rPr>
+                        <m:sty m:val="i"/>
+                      </m:rPr>
+                      <m:t>a</m:t>
+                    </m:r>
+                    <m:r>
+                      <m:rPr>
+                        <m:sty m:val="i"/>
+                      </m:rPr>
+                      <m:t>d</m:t>
+                    </m:r>
+                    <m:r>
+                      <m:rPr>
+                        <m:sty m:val="i"/>
+                      </m:rPr>
+                      <m:t>s</m:t>
+                    </m:r>
+                  </m:e>
+                </m:box>
+              </m:sub>
+            </m:sSub>
+            <m:r>
+              <m:rPr>
+                <m:sty m:val="p"/>
+              </m:rPr>
+              <m:t>[</m:t>
+            </m:r>
+            <m:box>
+              <m:e>
+                <m:r>
+                  <m:rPr>
+                    <m:sty m:val="p"/>
+                  </m:rPr>
+                  <m:t>e</m:t>
+                </m:r>
+                <m:r>
+                  <m:rPr>
+                    <m:sty m:val="p"/>
+                  </m:rPr>
+                  <m:t>V</m:t>
+                </m:r>
+              </m:e>
+            </m:box>
+            <m:r>
+              <m:rPr>
+                <m:sty m:val="p"/>
+              </m:rPr>
+              <m:t>]</m:t>
+            </m:r>
+          </m:e>
+        </m:box>
+      </m:oMath>
     </w:p>
     <w:p>
       <w:r>
@@ -7233,40 +8880,126 @@
       </w:r>
     </w:p>
     <w:p>
-      <w:r>
-        <w:drawing>
-          <wp:inline xmlns:a="http://schemas.openxmlformats.org/drawingml/2006/main" xmlns:pic="http://schemas.openxmlformats.org/drawingml/2006/picture">
-            <wp:extent cx="2511552" cy="499871"/>
-            <wp:docPr id="46" name="Picture 46"/>
-            <wp:cNvGraphicFramePr>
-              <a:graphicFrameLocks noChangeAspect="1"/>
-            </wp:cNvGraphicFramePr>
-            <a:graphic>
-              <a:graphicData uri="http://schemas.openxmlformats.org/drawingml/2006/picture">
-                <pic:pic>
-                  <pic:nvPicPr>
-                    <pic:cNvPr id="0" name="image.png"/>
-                    <pic:cNvPicPr/>
-                  </pic:nvPicPr>
-                  <pic:blipFill>
-                    <a:blip r:embed="rId54"/>
-                    <a:stretch>
-                      <a:fillRect/>
-                    </a:stretch>
-                  </pic:blipFill>
-                  <pic:spPr>
-                    <a:xfrm>
-                      <a:off x="0" y="0"/>
-                      <a:ext cx="2511552" cy="499871"/>
-                    </a:xfrm>
-                    <a:prstGeom prst="rect"/>
-                  </pic:spPr>
-                </pic:pic>
-              </a:graphicData>
-            </a:graphic>
-          </wp:inline>
-        </w:drawing>
-      </w:r>
+      <w:pPr>
+        <w:jc w:val="center"/>
+      </w:pPr>
+      <m:oMath>
+        <m:box>
+          <m:e>
+            <m:sSup>
+              <m:e>
+                <m:r>
+                  <m:rPr>
+                    <m:sty m:val="i"/>
+                  </m:rPr>
+                  <m:t>r</m:t>
+                </m:r>
+              </m:e>
+              <m:sup>
+                <m:box>
+                  <m:e>
+                    <m:r>
+                      <m:rPr>
+                        <m:sty m:val="p"/>
+                      </m:rPr>
+                      <m:t>*</m:t>
+                    </m:r>
+                  </m:e>
+                </m:box>
+              </m:sup>
+            </m:sSup>
+            <m:r>
+              <m:rPr>
+                <m:sty m:val="p"/>
+              </m:rPr>
+              <m:t>=</m:t>
+            </m:r>
+            <m:r>
+              <m:rPr>
+                <m:sty m:val="p"/>
+              </m:rPr>
+              <m:t>\arg</m:t>
+            </m:r>
+            <m:sSub>
+              <m:e>
+                <m:r>
+                  <m:rPr>
+                    <m:sty m:val="p"/>
+                  </m:rPr>
+                  <m:t>max</m:t>
+                </m:r>
+              </m:e>
+              <m:sub>
+                <m:box>
+                  <m:e>
+                    <m:r>
+                      <m:rPr>
+                        <m:sty m:val="i"/>
+                      </m:rPr>
+                      <m:t>r</m:t>
+                    </m:r>
+                  </m:e>
+                </m:box>
+              </m:sub>
+            </m:sSub>
+            <m:r>
+              <m:t/>
+            </m:r>
+            <m:sSub>
+              <m:e>
+                <m:r>
+                  <m:rPr>
+                    <m:sty m:val="i"/>
+                  </m:rPr>
+                  <m:t>g</m:t>
+                </m:r>
+              </m:e>
+              <m:sub>
+                <m:box>
+                  <m:e>
+                    <m:r>
+                      <m:rPr>
+                        <m:sty m:val="i"/>
+                      </m:rPr>
+                      <m:t>M</m:t>
+                    </m:r>
+                    <m:r>
+                      <m:rPr>
+                        <m:sty m:val="p"/>
+                      </m:rPr>
+                      <m:t>−</m:t>
+                    </m:r>
+                    <m:r>
+                      <m:rPr>
+                        <m:sty m:val="i"/>
+                      </m:rPr>
+                      <m:t>O</m:t>
+                    </m:r>
+                  </m:e>
+                </m:box>
+              </m:sub>
+            </m:sSub>
+            <m:r>
+              <m:rPr>
+                <m:sty m:val="p"/>
+              </m:rPr>
+              <m:t>(</m:t>
+            </m:r>
+            <m:r>
+              <m:rPr>
+                <m:sty m:val="i"/>
+              </m:rPr>
+              <m:t>r</m:t>
+            </m:r>
+            <m:r>
+              <m:rPr>
+                <m:sty m:val="p"/>
+              </m:rPr>
+              <m:t>)</m:t>
+            </m:r>
+          </m:e>
+        </m:box>
+      </m:oMath>
     </w:p>
     <w:p>
       <w:r>

</xml_diff>

<commit_message>
feat(report): number headings (to level 3) and fold Fukui/ESP into Stage 1
Number section (h2) and subsection (h3) headings hierarchically (1., 1.1 …) in
document order, identically in the HTML and Word reports (a regex pass for HTML,
a counter in report_docx's heading emitter). The title and deeper headings stay
unnumbered.

Fold Fukui and the ESP map into Stage 1 as subsections (3.7 / 3.8) instead of the
misleading "Stage 1b / 1c" stage badges: the pipeline has three stages, and both
are facets of Stage 1 (isolated-molecule QM), per docs/pipeline.md. Also fixed the
residual "Stage 1b" label on the Fukui equation group. Regenerated the bundle.

Co-Authored-By: Claude Opus 4.8 <noreply@anthropic.com>
</commit_message>
<xml_diff>
--- a/report/report.docx
+++ b/report/report.docx
@@ -16,7 +16,7 @@
           <w:b w:val="0"/>
           <w:color w:val="718096"/>
         </w:rPr>
-        <w:t>Substrate: Fe(110)  |  Medium: 1 M HCl  |  DFT level: B3LYP/6-311++G(d,p) (ddCOSMO:water)  |  Generated 2026-07-01 20:07</w:t>
+        <w:t>Substrate: Fe(110)  |  Medium: 1 M HCl  |  DFT level: B3LYP/6-311++G(d,p) (ddCOSMO:water)  |  Generated 2026-07-01 20:27</w:t>
       </w:r>
     </w:p>
     <w:p>
@@ -36,7 +36,7 @@
         <w:pStyle w:val="Heading1"/>
       </w:pPr>
       <w:r>
-        <w:t>Overview</w:t>
+        <w:t>1. Overview</w:t>
       </w:r>
     </w:p>
     <w:p>
@@ -113,7 +113,7 @@
         <w:pStyle w:val="Heading1"/>
       </w:pPr>
       <w:r>
-        <w:t>Summary &amp; ranking</w:t>
+        <w:t>2. Summary &amp; ranking</w:t>
       </w:r>
     </w:p>
     <w:tbl>
@@ -603,7 +603,7 @@
         <w:pStyle w:val="Heading1"/>
       </w:pPr>
       <w:r>
-        <w:t>Stage 1 — DFT electronic descriptors</w:t>
+        <w:t>3. Stage 1 — DFT electronic descriptors</w:t>
       </w:r>
     </w:p>
     <w:p>
@@ -741,7 +741,7 @@
         <w:pStyle w:val="Heading2"/>
       </w:pPr>
       <w:r>
-        <w:t>Frontier-orbital isosurfaces (HOMO / LUMO)</w:t>
+        <w:t>3.1 Frontier-orbital isosurfaces (HOMO / LUMO)</w:t>
       </w:r>
     </w:p>
     <w:p>
@@ -1201,7 +1201,7 @@
         <w:pStyle w:val="Heading2"/>
       </w:pPr>
       <w:r>
-        <w:t>Full descriptor table (neutral, aqueous)</w:t>
+        <w:t>3.2 Full descriptor table (neutral, aqueous)</w:t>
       </w:r>
     </w:p>
     <w:tbl>
@@ -2081,7 +2081,7 @@
         <w:pStyle w:val="Heading2"/>
       </w:pPr>
       <w:r>
-        <w:t>Geometry refinement (FF vs DFT-optimised)</w:t>
+        <w:t>3.3 Geometry refinement (FF vs DFT-optimised)</w:t>
       </w:r>
     </w:p>
     <w:p>
@@ -2150,7 +2150,7 @@
         <w:pStyle w:val="Heading2"/>
       </w:pPr>
       <w:r>
-        <w:t>Optimised-geometry descriptors (DFT-relaxed)</w:t>
+        <w:t>3.4 Optimised-geometry descriptors (DFT-relaxed)</w:t>
       </w:r>
     </w:p>
     <w:p>
@@ -3405,7 +3405,7 @@
         <w:pStyle w:val="Heading2"/>
       </w:pPr>
       <w:r>
-        <w:t>Species in the acidic medium (protonated cation)</w:t>
+        <w:t>3.5 Species in the acidic medium (protonated cation)</w:t>
       </w:r>
     </w:p>
     <w:p>
@@ -4233,10 +4233,10 @@
     </w:tbl>
     <w:p>
       <w:pPr>
-        <w:pStyle w:val="Heading3"/>
+        <w:pStyle w:val="Heading2"/>
       </w:pPr>
       <w:r>
-        <w:t>Speciation in 1 M HCl (pH ≈ -0.0)</w:t>
+        <w:t>3.6 Speciation in 1 M HCl (pH ≈ -0.0)</w:t>
       </w:r>
     </w:p>
     <w:p>
@@ -5303,10 +5303,10 @@
     </w:p>
     <w:p>
       <w:pPr>
-        <w:pStyle w:val="Heading1"/>
+        <w:pStyle w:val="Heading2"/>
       </w:pPr>
       <w:r>
-        <w:t>Stage 1b — Local reactivity (Fukui)</w:t>
+        <w:t>3.7 Local reactivity (Fukui)</w:t>
       </w:r>
     </w:p>
     <w:p>
@@ -5535,7 +5535,7 @@
         <w:pStyle w:val="Heading2"/>
       </w:pPr>
       <w:r>
-        <w:t>Electrostatic-potential (ESP) map</w:t>
+        <w:t>3.8 Electrostatic-potential (ESP) map</w:t>
       </w:r>
     </w:p>
     <w:p>
@@ -5716,7 +5716,7 @@
         <w:pStyle w:val="Heading1"/>
       </w:pPr>
       <w:r>
-        <w:t>Stage 2 — Monte Carlo adsorption</w:t>
+        <w:t>4. Stage 2 — Monte Carlo adsorption</w:t>
       </w:r>
     </w:p>
     <w:p>
@@ -6062,7 +6062,7 @@
         <w:pStyle w:val="Heading1"/>
       </w:pPr>
       <w:r>
-        <w:t>Stage 3 — Brownian MD (Fe-O RDF)</w:t>
+        <w:t>5. Stage 3 — Brownian MD (Fe-O RDF)</w:t>
       </w:r>
     </w:p>
     <w:p>
@@ -6243,7 +6243,7 @@
         <w:pStyle w:val="Heading1"/>
       </w:pPr>
       <w:r>
-        <w:t>Scientific basis &amp; validation</w:t>
+        <w:t>6. Scientific basis &amp; validation</w:t>
       </w:r>
     </w:p>
     <w:p>
@@ -6271,7 +6271,7 @@
         <w:pStyle w:val="Heading2"/>
       </w:pPr>
       <w:r>
-        <w:t>Governing equations</w:t>
+        <w:t>6.1 Governing equations</w:t>
       </w:r>
     </w:p>
     <w:p>
@@ -7383,7 +7383,7 @@
         <w:pStyle w:val="Heading3"/>
       </w:pPr>
       <w:r>
-        <w:t>Stage 1b — local reactivity (condensed Fukui)</w:t>
+        <w:t>Stage 1 — local reactivity (condensed Fukui)</w:t>
       </w:r>
     </w:p>
     <w:p>
@@ -9021,7 +9021,7 @@
         <w:pStyle w:val="Heading2"/>
       </w:pPr>
       <w:r>
-        <w:t>Descriptor results (B3LYP/6-311++G(d,p), neutral, aqueous)</w:t>
+        <w:t>6.2 Descriptor results (B3LYP/6-311++G(d,p), neutral, aqueous)</w:t>
       </w:r>
     </w:p>
     <w:p>
@@ -9487,7 +9487,7 @@
         <w:pStyle w:val="Heading2"/>
       </w:pPr>
       <w:r>
-        <w:t>Protonation resolved by a computed pKaH</w:t>
+        <w:t>6.3 Protonation resolved by a computed pKaH</w:t>
       </w:r>
     </w:p>
     <w:p>
@@ -9503,7 +9503,7 @@
         <w:pStyle w:val="Heading2"/>
       </w:pPr>
       <w:r>
-        <w:t>Cross-check against published Fe(110) studies</w:t>
+        <w:t>6.4 Cross-check against published Fe(110) studies</w:t>
       </w:r>
     </w:p>
     <w:p>
@@ -9519,7 +9519,7 @@
         <w:pStyle w:val="Heading2"/>
       </w:pPr>
       <w:r>
-        <w:t>Experimental anchor — Mohammed 2014 (Arghel on mild steel, 1 M HCl)</w:t>
+        <w:t>6.5 Experimental anchor — Mohammed 2014 (Arghel on mild steel, 1 M HCl)</w:t>
       </w:r>
     </w:p>
     <w:p>
@@ -10174,7 +10174,7 @@
         <w:pStyle w:val="Heading2"/>
       </w:pPr>
       <w:r>
-        <w:t>What this does and does not settle</w:t>
+        <w:t>6.6 What this does and does not settle</w:t>
       </w:r>
     </w:p>
     <w:p>
@@ -10208,7 +10208,7 @@
         <w:pStyle w:val="Heading1"/>
       </w:pPr>
       <w:r>
-        <w:t>Method &amp; caveats</w:t>
+        <w:t>7. Method &amp; caveats</w:t>
       </w:r>
     </w:p>
     <w:p>

</xml_diff>

<commit_message>
feat(pka): fold frequency-corrected pKaH into the report (resolves #18)
The detached frequency-correction QM job finished for all three flavonoids; its
values are now the canonical results/pka.json (transient pka_freq.json removed).
The ZPE/thermal/entropy correction moves every pKaH more negative (quercetin
-13.3, kaempferol -12.9, isorhamnetin -5.1), so all stay < 0.1% protonated in
1 M HCl and the quercetin lead is robust — now on a clean, imaginary-frequency-
free calculation.

Verification surfaced one caveat: the isorhamnetin cation retained a single
imaginary frequency (a low methoxy/hydroxyl torsion), so its value is less
tightly determined. Documented in validation.md, ADR 0005 and the report; it
does not change the conclusion (isorhamnetin stays neutral and is not the lead).

Regenerated the report bundle (speciation section now frequency-corrected).

Resolves #18.

Co-Authored-By: Claude Opus 4.8 <noreply@anthropic.com>
</commit_message>
<xml_diff>
--- a/report/report.docx
+++ b/report/report.docx
@@ -16,7 +16,7 @@
           <w:b w:val="0"/>
           <w:color w:val="718096"/>
         </w:rPr>
-        <w:t>Substrate: Fe(110)  |  Medium: 1 M HCl  |  DFT level: B3LYP/6-311++G(d,p) (ddCOSMO:water)  |  Generated 2026-07-01 20:27</w:t>
+        <w:t>Substrate: Fe(110)  |  Medium: 1 M HCl  |  DFT level: B3LYP/6-311++G(d,p) (ddCOSMO:water)  |  Generated 2026-07-02 07:18</w:t>
       </w:r>
     </w:p>
     <w:p>
@@ -5100,7 +5100,7 @@
         <w:rPr>
           <w:b w:val="0"/>
         </w:rPr>
-        <w:t>Computed pKaH (DFT deprotonation cycle, electronic-only) resolves it: the most basic flavonoid is only 0.05% protonated, so every species is essentially fully neutral and the headline lead is robust.</w:t>
+        <w:t>Computed pKaH (DFT deprotonation cycle, frequency-corrected) resolves it: the most basic flavonoid is only 0.00% protonated, so every species is essentially fully neutral and the headline lead is robust.</w:t>
       </w:r>
     </w:p>
     <w:tbl>
@@ -5183,7 +5183,7 @@
                 <w:b w:val="0"/>
                 <w:sz w:val="17"/>
               </w:rPr>
-              <w:t>-11.2</w:t>
+              <w:t>-12.9</w:t>
             </w:r>
           </w:p>
         </w:tc>
@@ -5227,7 +5227,7 @@
                 <w:b w:val="0"/>
                 <w:sz w:val="17"/>
               </w:rPr>
-              <w:t>-12.1</w:t>
+              <w:t>-13.3</w:t>
             </w:r>
           </w:p>
         </w:tc>
@@ -5271,7 +5271,7 @@
                 <w:b w:val="0"/>
                 <w:sz w:val="17"/>
               </w:rPr>
-              <w:t>-3.3</w:t>
+              <w:t>-5.1</w:t>
             </w:r>
           </w:p>
         </w:tc>
@@ -5285,7 +5285,7 @@
                 <w:b w:val="0"/>
                 <w:sz w:val="17"/>
               </w:rPr>
-              <w:t>0.05%</w:t>
+              <w:t>0.00%</w:t>
             </w:r>
           </w:p>
         </w:tc>
@@ -9495,7 +9495,27 @@
         <w:rPr>
           <w:b w:val="0"/>
         </w:rPr>
-        <w:t>The most basic site is the 4-oxo carbonyl, a very weak base. A DFT deprotonation cycle (B3LYP/6-311++G(d,p) + ddCOSMO) gives pKaH ≈ −12.1 (quercetin), −11.2 (kaempferol) and −3.3 (isorhamnetin) — all far below the 5–7% crossover — so every flavonoid is under 0.1% protonated in 1 M HCl. The neutral form is physically dominant, so the neutral-basis ranking is robust, not merely conventional.</w:t>
+        <w:t xml:space="preserve">The most basic site is the 4-oxo carbonyl, a very weak base. A frequency-corrected DFT deprotonation cycle (B3LYP/6-311++G(d,p) + ddCOSMO on gas opt+freq geometries) gives pKaH ≈ </w:t>
+      </w:r>
+      <w:r>
+        <w:rPr>
+          <w:b/>
+        </w:rPr>
+        <w:t>−13.3</w:t>
+      </w:r>
+      <w:r>
+        <w:rPr>
+          <w:b w:val="0"/>
+        </w:rPr>
+        <w:t xml:space="preserve"> (quercetin), −12.9 (kaempferol) and −5.1 (isorhamnetin) — all far below the 5–7% crossover — so every flavonoid is under 0.1% protonated in 1 M HCl. The neutral form is physically dominant, so the neutral-basis ranking is robust, not merely conventional; the ZPE/thermal/entropy correction moved every value more negative (more neutral) than the uncorrected cycle.</w:t>
+      </w:r>
+    </w:p>
+    <w:p>
+      <w:r>
+        <w:rPr>
+          <w:b w:val="0"/>
+        </w:rPr>
+        <w:t>*Caveat:* quercetin and kaempferol are clean minima (no imaginary frequencies); the isorhamnetin cation retained one small imaginary mode (a methoxy/hydroxyl torsion), so its value is less tightly determined — but it stays neutral and is not the lead. The lead (quercetin) rests on a clean, imaginary-frequency-free calculation.</w:t>
       </w:r>
     </w:p>
     <w:p>

</xml_diff>

<commit_message>
docs(report): clarify ranking uses DFT descriptors; MC/MD validate
Make explicit that the composite ranking is the DFT global descriptors alone
(z-scored gap/hardness/softness, on the neutral form) and that the Monte Carlo
E_ads and the Brownian-MD metal-O distance are validation of adsorption, not
inputs to the score.

pipeline.md: new "Ranking" section plus an overview pointer. report_content.py:
strengthen score_explanation and add short clauses to the MC/MD stage intros.
Report bundle regenerated; dev-journal entry for the session.

Co-Authored-By: Claude Opus 4.8 <noreply@anthropic.com>
</commit_message>
<xml_diff>
--- a/report/report.docx
+++ b/report/report.docx
@@ -16,7 +16,7 @@
           <w:b w:val="0"/>
           <w:color w:val="718096"/>
         </w:rPr>
-        <w:t>Substrate: Fe(110)  |  Medium: 1 M HCl  |  DFT level: B3LYP/6-311++G(d,p) (ddCOSMO:water)  |  Generated 2026-07-04 07:35</w:t>
+        <w:t>Substrate: Fe(110)  |  Medium: 1 M HCl  |  DFT level: B3LYP/6-311++G(d,p) (ddCOSMO:water)  |  Generated 2026-07-04 07:36</w:t>
       </w:r>
     </w:p>
     <w:p>
@@ -628,7 +628,35 @@
           <w:b w:val="0"/>
           <w:color w:val="718096"/>
         </w:rPr>
-        <w:t xml:space="preserve"> — a relative ranking within these candidates, not an absolute scale. E_ads (from the Monte-Carlo pose search) and the Fe–O distance (from the molecular-dynamics run) are shown alongside for the adsorption picture.</w:t>
+        <w:t xml:space="preserve"> — a relative ranking within these candidates, not an absolute scale. </w:t>
+      </w:r>
+      <w:r>
+        <w:rPr>
+          <w:b/>
+          <w:color w:val="718096"/>
+        </w:rPr>
+        <w:t>The ranking is these electronic descriptors alone.</w:t>
+      </w:r>
+      <w:r>
+        <w:rPr>
+          <w:b w:val="0"/>
+          <w:color w:val="718096"/>
+        </w:rPr>
+        <w:t xml:space="preserve"> E_ads (from the Monte-Carlo pose search) and the Fe–O distance (from the molecular-dynamics run) are shown alongside the score to </w:t>
+      </w:r>
+      <w:r>
+        <w:rPr>
+          <w:b/>
+          <w:color w:val="718096"/>
+        </w:rPr>
+        <w:t>validate</w:t>
+      </w:r>
+      <w:r>
+        <w:rPr>
+          <w:b w:val="0"/>
+          <w:color w:val="718096"/>
+        </w:rPr>
+        <w:t xml:space="preserve"> that the top candidates actually adsorb (flat, in the physisorption range) — they are not inputs to the ranking.</w:t>
       </w:r>
     </w:p>
     <w:p>
@@ -5757,7 +5785,7 @@
         <w:rPr>
           <w:b w:val="0"/>
         </w:rPr>
-        <w:t>A Metropolis / simulated-annealing Monte-Carlo search nudges and rotates the rigid molecule thousands of times over an Fe(110) slab to find the lowest-energy pose, scored with the UFF van-der-Waals interaction. The flavonoids settle flat/parallel to the surface; the adsorption energy E_ads ≈ −16 kJ/mol places them in the physisorption regime. Software: the periodic metal slab is built with ASE — the standard Atomic Simulation Environment (its bcc110 builder for Fe(110)) — and the van-der-Waals parameters are the published UFF set (Rappé et al. 1992); the Metropolis/simulated-annealing search and the van-der-Waals scoring are corrosim's own implementation, not an external Monte-Carlo package. It reproduces the role of Materials Studio's Adsorption Locator with free tools.</w:t>
+        <w:t>A Metropolis / simulated-annealing Monte-Carlo search nudges and rotates the rigid molecule thousands of times over an Fe(110) slab to find the lowest-energy pose, scored with the UFF van-der-Waals interaction. The flavonoids settle flat/parallel to the surface; the adsorption energy E_ads ≈ −16 kJ/mol places them in the physisorption regime. This adsorption picture validates the DFT-based ranking; it is reported alongside the score, not folded into it. Software: the periodic metal slab is built with ASE — the standard Atomic Simulation Environment (its bcc110 builder for Fe(110)) — and the van-der-Waals parameters are the published UFF set (Rappé et al. 1992); the Metropolis/simulated-annealing search and the van-der-Waals scoring are corrosim's own implementation, not an external Monte-Carlo package. It reproduces the role of Materials Studio's Adsorption Locator with free tools.</w:t>
       </w:r>
     </w:p>
     <w:p>
@@ -6103,7 +6131,7 @@
         <w:rPr>
           <w:b w:val="0"/>
         </w:rPr>
-        <w:t>Starting from the best Monte-Carlo pose, a Brownian rigid-body molecular-dynamics run lets the molecule jiggle at 298 K. The first peak of the metal-O radial distribution function g(r) sets the adsorption distance; a peak near 3.5 Å is physisorption range (a chemisorbed contact would sit closer).</w:t>
+        <w:t>Starting from the best Monte-Carlo pose, a Brownian rigid-body molecular-dynamics run lets the molecule jiggle at 298 K. The first peak of the metal-O radial distribution function g(r) sets the adsorption distance; a peak near 3.5 Å is physisorption range (a chemisorbed contact would sit closer). Like the Monte-Carlo E_ads, this distance validates the ranking rather than contributing to the score.</w:t>
       </w:r>
     </w:p>
     <w:p>

</xml_diff>

<commit_message>
fix(surface): orient_flat lays molecule flat, not vertical (#47)
np.linalg.svd returns vt rows in descending spread, so R = vt[::-1].T
mapped the largest-spread axis onto z — standing the molecule up instead
of laying it flat. Drop the reversal (R = vt.T) so the least-spread axis
maps to z and the molecular plane lies in xy for maximum slab contact.

Add an orientation-asserting test; the prior isometry test could not
catch a wrong rotation (any rotation is an isometry). Regenerate the
dependent artifacts in the same change: md_rdf.json (Fe-O first peaks
shift, kaempferol still adsorbs closest — ranking preserved), the
fig5/fig6 MC/MD figures, and the report bundle; correct a stale
hardcoded RDF-peak value in the cross-check prose.

Closes #47

Co-Authored-By: Claude Opus 4.8 <noreply@anthropic.com>
</commit_message>
<xml_diff>
--- a/report/report.docx
+++ b/report/report.docx
@@ -16,7 +16,7 @@
           <w:b w:val="0"/>
           <w:color w:val="718096"/>
         </w:rPr>
-        <w:t>Substrate: Fe(110)  |  Medium: 1 M HCl  |  DFT level: B3LYP/6-311++G(d,p) (ddCOSMO:water)  |  Generated 2026-07-04 07:36</w:t>
+        <w:t>Substrate: Fe(110)  |  Medium: 1 M HCl  |  DFT level: B3LYP/6-311++G(d,p) (ddCOSMO:water)  |  Generated 2026-07-04 11:34</w:t>
       </w:r>
     </w:p>
     <w:p>
@@ -353,7 +353,7 @@
                 <w:b/>
                 <w:sz w:val="17"/>
               </w:rPr>
-              <w:t>3.65</w:t>
+              <w:t>3.25</w:t>
             </w:r>
           </w:p>
         </w:tc>
@@ -581,7 +581,7 @@
                 <w:b w:val="0"/>
                 <w:sz w:val="17"/>
               </w:rPr>
-              <w:t>3.35</w:t>
+              <w:t>3.15</w:t>
             </w:r>
           </w:p>
         </w:tc>
@@ -9592,7 +9592,7 @@
         <w:rPr>
           <w:b w:val="0"/>
         </w:rPr>
-        <w:t>corrosim's Stage-2 adsorption energies (−16.0 / −16.6 / −16.7 kJ/mol for quercetin / kaempferol / isorhamnetin) and Stage-3 Fe-O RDF first peaks (3.65 / 3.35 / 3.75 Å) agree with an independent black-tea-extract DFT study on Fe(110) (ΔGads ≈ −20 kJ/mol, quercetin strongest) and a lady's-mantle study (kaempferol reference) — same regime, same order.</w:t>
+        <w:t>corrosim's Stage-2 adsorption energies (−16.0 / −16.6 / −16.7 kJ/mol for quercetin / kaempferol / isorhamnetin) and Stage-3 Fe-O RDF first peaks (3.25 / 3.15 / 3.75 Å) agree with an independent black-tea-extract DFT study on Fe(110) (ΔGads ≈ −20 kJ/mol, quercetin strongest) and a lady's-mantle study (kaempferol reference) — same regime, same order.</w:t>
       </w:r>
     </w:p>
     <w:p>

</xml_diff>

<commit_message>
fix(surface): orient_flat lays molecule flat, not vertical (#47) (#75)
np.linalg.svd returns vt rows in descending spread, so R = vt[::-1].T
mapped the largest-spread axis onto z — standing the molecule up instead
of laying it flat. Drop the reversal (R = vt.T) so the least-spread axis
maps to z and the molecular plane lies in xy for maximum slab contact.

Add an orientation-asserting test; the prior isometry test could not
catch a wrong rotation (any rotation is an isometry). Regenerate the
dependent artifacts in the same change: md_rdf.json (Fe-O first peaks
shift, kaempferol still adsorbs closest — ranking preserved), the
fig5/fig6 MC/MD figures, and the report bundle; correct a stale
hardcoded RDF-peak value in the cross-check prose.

Closes #47

Co-authored-by: Claude Opus 4.8 <noreply@anthropic.com>
</commit_message>
<xml_diff>
--- a/report/report.docx
+++ b/report/report.docx
@@ -16,7 +16,7 @@
           <w:b w:val="0"/>
           <w:color w:val="718096"/>
         </w:rPr>
-        <w:t>Substrate: Fe(110)  |  Medium: 1 M HCl  |  DFT level: B3LYP/6-311++G(d,p) (ddCOSMO:water)  |  Generated 2026-07-04 07:36</w:t>
+        <w:t>Substrate: Fe(110)  |  Medium: 1 M HCl  |  DFT level: B3LYP/6-311++G(d,p) (ddCOSMO:water)  |  Generated 2026-07-04 11:34</w:t>
       </w:r>
     </w:p>
     <w:p>
@@ -353,7 +353,7 @@
                 <w:b/>
                 <w:sz w:val="17"/>
               </w:rPr>
-              <w:t>3.65</w:t>
+              <w:t>3.25</w:t>
             </w:r>
           </w:p>
         </w:tc>
@@ -581,7 +581,7 @@
                 <w:b w:val="0"/>
                 <w:sz w:val="17"/>
               </w:rPr>
-              <w:t>3.35</w:t>
+              <w:t>3.15</w:t>
             </w:r>
           </w:p>
         </w:tc>
@@ -9592,7 +9592,7 @@
         <w:rPr>
           <w:b w:val="0"/>
         </w:rPr>
-        <w:t>corrosim's Stage-2 adsorption energies (−16.0 / −16.6 / −16.7 kJ/mol for quercetin / kaempferol / isorhamnetin) and Stage-3 Fe-O RDF first peaks (3.65 / 3.35 / 3.75 Å) agree with an independent black-tea-extract DFT study on Fe(110) (ΔGads ≈ −20 kJ/mol, quercetin strongest) and a lady's-mantle study (kaempferol reference) — same regime, same order.</w:t>
+        <w:t>corrosim's Stage-2 adsorption energies (−16.0 / −16.6 / −16.7 kJ/mol for quercetin / kaempferol / isorhamnetin) and Stage-3 Fe-O RDF first peaks (3.25 / 3.15 / 3.75 Å) agree with an independent black-tea-extract DFT study on Fe(110) (ΔGads ≈ −20 kJ/mol, quercetin strongest) and a lady's-mantle study (kaempferol reference) — same regime, same order.</w:t>
       </w:r>
     </w:p>
     <w:p>

</xml_diff>